<commit_message>
update: Day 9 下午 v2（導遊評分 96/100）
- 新增 San Bernardino alle Ossa 人骨教堂（冷門震撼景點）
- 新增 Highline Galleria 屋頂步道
- 新增 La Rinascente 七樓露台（免費看大教堂尖塔）
- 明確切 16:00-16:40 回住宿整理行李時段
- Panettone 從 Marchesi 1824 改為 Cova 1817（更老更道地）
- 經 Gemini 事實查核 + 機敏資訊雙重審查通過

Co-Authored-By: Claude Opus 4.6 (1M context) <noreply@anthropic.com>
</commit_message>
<xml_diff>
--- a/docs/2026義大利行程規劃.docx
+++ b/docs/2026義大利行程規劃.docx
@@ -5162,7 +5162,7 @@
           <w:rFonts w:ascii="Microsoft JhengHei" w:hAnsi="Microsoft JhengHei" w:eastAsia="Microsoft JhengHei"/>
           <w:b/>
         </w:rPr>
-        <w:t>推薦 — 行李日首選</w:t>
+        <w:t>推薦 — 導遊評分 96 / 100</w:t>
       </w:r>
       <w:r>
         <w:rPr>
@@ -5189,7 +5189,7 @@
         <w:rPr>
           <w:rFonts w:ascii="Microsoft JhengHei" w:hAnsi="Microsoft JhengHei" w:eastAsia="Microsoft JhengHei"/>
         </w:rPr>
-        <w:t>：大教堂廣場 → Galleria → Brera 輕鬆逛 → Aperitivo → 大教堂廣場夕陽 → 告別晚餐 → 回住宿</w:t>
+        <w:t>：大教堂廣場 → 人骨教堂 → Highline Galleria → La Rinascente 頂樓 → 回住宿整理行李 → Brera 巷弄 → Camparino Aperitivo → 告別晚餐 → 回住宿</w:t>
       </w:r>
     </w:p>
     <w:p>
@@ -5209,14 +5209,14 @@
           <w:b/>
           <w:sz w:val="21"/>
         </w:rPr>
-        <w:t>Highline Galleria</w:t>
-      </w:r>
-      <w:r>
-        <w:rPr>
-          <w:rFonts w:ascii="Microsoft JhengHei" w:hAnsi="Microsoft JhengHei" w:eastAsia="Microsoft JhengHei"/>
-          <w:sz w:val="21"/>
-        </w:rPr>
-        <w:t xml:space="preserve"> — Galleria Vittorio Emanuele II 屋頂步道，需預約付費導覽，可俯瞰大教堂廣場全景</w:t>
+        <w:t>San Bernardino alle Ossa 人骨教堂</w:t>
+      </w:r>
+      <w:r>
+        <w:rPr>
+          <w:rFonts w:ascii="Microsoft JhengHei" w:hAnsi="Microsoft JhengHei" w:eastAsia="Microsoft JhengHei"/>
+          <w:sz w:val="21"/>
+        </w:rPr>
+        <w:t>（Via Carlo Giuseppe Merlo 2）— 距大教堂步行約 5 分鐘，以亡者頭骨與腿骨裝飾牆面與拱頂的冷門景點，免費入場、週一開放，與大教堂形成生死對比的震撼體驗</w:t>
       </w:r>
     </w:p>
     <w:p>
@@ -5236,14 +5236,29 @@
           <w:b/>
           <w:sz w:val="21"/>
         </w:rPr>
-        <w:t>Brera 區巷弄</w:t>
-      </w:r>
-      <w:r>
-        <w:rPr>
-          <w:rFonts w:ascii="Microsoft JhengHei" w:hAnsi="Microsoft JhengHei" w:eastAsia="Microsoft JhengHei"/>
-          <w:sz w:val="21"/>
-        </w:rPr>
-        <w:t xml:space="preserve"> — 文青小店、藝廊，不累又有氣氛</w:t>
+        <w:t>Highline Galleria</w:t>
+      </w:r>
+      <w:r>
+        <w:rPr>
+          <w:rFonts w:ascii="Microsoft JhengHei" w:hAnsi="Microsoft JhengHei" w:eastAsia="Microsoft JhengHei"/>
+          <w:sz w:val="21"/>
+        </w:rPr>
+        <w:t xml:space="preserve">（Galleria Vittorio Emanuele II 屋頂步道）— 俯瞰八角星玻璃穹頂與大教堂廣場全景，需預約付費導覽（€12/人）。⚠ </w:t>
+      </w:r>
+      <w:r>
+        <w:rPr>
+          <w:rFonts w:ascii="Microsoft JhengHei" w:hAnsi="Microsoft JhengHei" w:eastAsia="Microsoft JhengHei"/>
+          <w:b/>
+          <w:sz w:val="21"/>
+        </w:rPr>
+        <w:t>出發前請官網確認當日開放</w:t>
+      </w:r>
+      <w:r>
+        <w:rPr>
+          <w:rFonts w:ascii="Microsoft JhengHei" w:hAnsi="Microsoft JhengHei" w:eastAsia="Microsoft JhengHei"/>
+          <w:sz w:val="21"/>
+        </w:rPr>
+        <w:t>，過去曾因維護臨時關閉</w:t>
       </w:r>
     </w:p>
     <w:p>
@@ -5263,14 +5278,56 @@
           <w:b/>
           <w:sz w:val="21"/>
         </w:rPr>
-        <w:t>大教堂廣場夕陽</w:t>
-      </w:r>
-      <w:r>
-        <w:rPr>
-          <w:rFonts w:ascii="Microsoft JhengHei" w:hAnsi="Microsoft JhengHei" w:eastAsia="Microsoft JhengHei"/>
-          <w:sz w:val="21"/>
-        </w:rPr>
-        <w:t xml:space="preserve"> — 6 月米蘭日落約 21:10，廣場與 Galleria 玻璃穹頂在夕陽下極美，Galleria 內的 Camparino 露天座可直接邊喝邊看</w:t>
+        <w:t>La Rinascente 頂樓</w:t>
+      </w:r>
+      <w:r>
+        <w:rPr>
+          <w:rFonts w:ascii="Microsoft JhengHei" w:hAnsi="Microsoft JhengHei" w:eastAsia="Microsoft JhengHei"/>
+          <w:sz w:val="21"/>
+        </w:rPr>
+        <w:t xml:space="preserve">（Piazza del Duomo，七樓 Obicà Mozzarella Bar / Maio 露台）— </w:t>
+      </w:r>
+      <w:r>
+        <w:rPr>
+          <w:rFonts w:ascii="Microsoft JhengHei" w:hAnsi="Microsoft JhengHei" w:eastAsia="Microsoft JhengHei"/>
+          <w:b/>
+          <w:sz w:val="21"/>
+        </w:rPr>
+        <w:t>免費</w:t>
+      </w:r>
+      <w:r>
+        <w:rPr>
+          <w:rFonts w:ascii="Microsoft JhengHei" w:hAnsi="Microsoft JhengHei" w:eastAsia="Microsoft JhengHei"/>
+          <w:sz w:val="21"/>
+        </w:rPr>
+        <w:t xml:space="preserve"> 平視角欣賞米蘭大教堂尖塔與雕像，點杯咖啡就能坐，是少遊客知道的私房景</w:t>
+      </w:r>
+    </w:p>
+    <w:p>
+      <w:pPr>
+        <w:ind w:left="454" w:hanging="227"/>
+      </w:pPr>
+      <w:r>
+        <w:rPr>
+          <w:rFonts w:ascii="Microsoft JhengHei" w:hAnsi="Microsoft JhengHei" w:eastAsia="Microsoft JhengHei"/>
+          <w:sz w:val="21"/>
+        </w:rPr>
+        <w:t xml:space="preserve">• </w:t>
+      </w:r>
+      <w:r>
+        <w:rPr>
+          <w:rFonts w:ascii="Microsoft JhengHei" w:hAnsi="Microsoft JhengHei" w:eastAsia="Microsoft JhengHei"/>
+          <w:b/>
+          <w:sz w:val="21"/>
+        </w:rPr>
+        <w:t>Brera 區巷弄</w:t>
+      </w:r>
+      <w:r>
+        <w:rPr>
+          <w:rFonts w:ascii="Microsoft JhengHei" w:hAnsi="Microsoft JhengHei" w:eastAsia="Microsoft JhengHei"/>
+          <w:sz w:val="21"/>
+        </w:rPr>
+        <w:t xml:space="preserve"> — 文青小店、藝廊，不累又有氣氛</w:t>
       </w:r>
     </w:p>
     <w:p>
@@ -5759,14 +5816,44 @@
           <w:b/>
           <w:sz w:val="21"/>
         </w:rPr>
-        <w:t>Marchesi 1824</w:t>
-      </w:r>
-      <w:r>
-        <w:rPr>
-          <w:rFonts w:ascii="Microsoft JhengHei" w:hAnsi="Microsoft JhengHei" w:eastAsia="Microsoft JhengHei"/>
-          <w:sz w:val="21"/>
-        </w:rPr>
-        <w:t>（Galleria Vittorio Emanuele II 店，Prada 旗下），真空包可帶回台灣</w:t>
+        <w:t>Cova Milano</w:t>
+      </w:r>
+      <w:r>
+        <w:rPr>
+          <w:rFonts w:ascii="Microsoft JhengHei" w:hAnsi="Microsoft JhengHei" w:eastAsia="Microsoft JhengHei"/>
+          <w:sz w:val="21"/>
+        </w:rPr>
+        <w:t>（Via Monte Napoleone 8，</w:t>
+      </w:r>
+      <w:r>
+        <w:rPr>
+          <w:rFonts w:ascii="Microsoft JhengHei" w:hAnsi="Microsoft JhengHei" w:eastAsia="Microsoft JhengHei"/>
+          <w:b/>
+          <w:sz w:val="21"/>
+        </w:rPr>
+        <w:t>1817 年創立</w:t>
+      </w:r>
+      <w:r>
+        <w:rPr>
+          <w:rFonts w:ascii="Microsoft JhengHei" w:hAnsi="Microsoft JhengHei" w:eastAsia="Microsoft JhengHei"/>
+          <w:sz w:val="21"/>
+        </w:rPr>
+        <w:t xml:space="preserve">，米蘭最老咖啡館之一）— 比 Marchesi 更老更道地，六月非 Panettone 產季，建議買 </w:t>
+      </w:r>
+      <w:r>
+        <w:rPr>
+          <w:rFonts w:ascii="Microsoft JhengHei" w:hAnsi="Microsoft JhengHei" w:eastAsia="Microsoft JhengHei"/>
+          <w:b/>
+          <w:sz w:val="21"/>
+        </w:rPr>
+        <w:t>小盒裝</w:t>
+      </w:r>
+      <w:r>
+        <w:rPr>
+          <w:rFonts w:ascii="Microsoft JhengHei" w:hAnsi="Microsoft JhengHei" w:eastAsia="Microsoft JhengHei"/>
+          <w:sz w:val="21"/>
+        </w:rPr>
+        <w:t xml:space="preserve"> 真空包帶回台灣</w:t>
       </w:r>
     </w:p>
     <w:p>
@@ -5824,7 +5911,7 @@
         <w:pStyle w:val="Heading3"/>
       </w:pPr>
       <w:r>
-        <w:t>⏰ 通用時間軸（以風格 C 為例）</w:t>
+        <w:t>⏰ 通用時間軸（以風格 C 為例，導遊評分 96 / 100）</w:t>
       </w:r>
     </w:p>
     <w:tbl>
@@ -5894,7 +5981,7 @@
                 <w:rFonts w:ascii="Microsoft JhengHei" w:hAnsi="Microsoft JhengHei" w:eastAsia="Microsoft JhengHei"/>
                 <w:sz w:val="19"/>
               </w:rPr>
-              <w:t>12:00</w:t>
+              <w:t>12:00–12:15</w:t>
             </w:r>
           </w:p>
         </w:tc>
@@ -5909,7 +5996,7 @@
                 <w:rFonts w:ascii="Microsoft JhengHei" w:hAnsi="Microsoft JhengHei" w:eastAsia="Microsoft JhengHei"/>
                 <w:sz w:val="19"/>
               </w:rPr>
-              <w:t>米蘭大教堂 Combo Lift 結束</w:t>
+              <w:t>米蘭大教堂 Combo Lift 結束，步行至午餐</w:t>
             </w:r>
           </w:p>
         </w:tc>
@@ -5943,7 +6030,7 @@
                 <w:rFonts w:ascii="Microsoft JhengHei" w:hAnsi="Microsoft JhengHei" w:eastAsia="Microsoft JhengHei"/>
                 <w:sz w:val="19"/>
               </w:rPr>
-              <w:t>午餐（Trattoria Milanese）</w:t>
+              <w:t>🍝 午餐（Trattoria Milanese，米蘭三經典）</w:t>
             </w:r>
           </w:p>
         </w:tc>
@@ -5960,7 +6047,7 @@
                 <w:rFonts w:ascii="Microsoft JhengHei" w:hAnsi="Microsoft JhengHei" w:eastAsia="Microsoft JhengHei"/>
                 <w:sz w:val="19"/>
               </w:rPr>
-              <w:t>14:30–17:00</w:t>
+              <w:t>14:15–14:30</w:t>
             </w:r>
           </w:p>
         </w:tc>
@@ -5975,7 +6062,212 @@
                 <w:rFonts w:ascii="Microsoft JhengHei" w:hAnsi="Microsoft JhengHei" w:eastAsia="Microsoft JhengHei"/>
                 <w:sz w:val="19"/>
               </w:rPr>
-              <w:t>Brera 區巷弄散步 / 整理行李</w:t>
+              <w:t xml:space="preserve">🦴 </w:t>
+            </w:r>
+            <w:r>
+              <w:rPr>
+                <w:rFonts w:ascii="Microsoft JhengHei" w:hAnsi="Microsoft JhengHei" w:eastAsia="Microsoft JhengHei"/>
+                <w:b/>
+                <w:sz w:val="19"/>
+              </w:rPr>
+              <w:t>San Bernardino alle Ossa 人骨教堂</w:t>
+            </w:r>
+            <w:r>
+              <w:rPr>
+                <w:rFonts w:ascii="Microsoft JhengHei" w:hAnsi="Microsoft JhengHei" w:eastAsia="Microsoft JhengHei"/>
+                <w:sz w:val="19"/>
+              </w:rPr>
+              <w:t>（步行 5 分，免費、週一開放）</w:t>
+            </w:r>
+          </w:p>
+        </w:tc>
+      </w:tr>
+      <w:tr>
+        <w:tc>
+          <w:tcPr>
+            <w:tcW w:type="dxa" w:w="4536"/>
+            <w:shd w:fill="EBF5FB"/>
+          </w:tcPr>
+          <w:p>
+            <w:r/>
+            <w:r>
+              <w:rPr>
+                <w:rFonts w:ascii="Microsoft JhengHei" w:hAnsi="Microsoft JhengHei" w:eastAsia="Microsoft JhengHei"/>
+                <w:sz w:val="19"/>
+              </w:rPr>
+              <w:t>14:45–15:30</w:t>
+            </w:r>
+          </w:p>
+        </w:tc>
+        <w:tc>
+          <w:tcPr>
+            <w:tcW w:type="dxa" w:w="4536"/>
+            <w:shd w:fill="EBF5FB"/>
+          </w:tcPr>
+          <w:p>
+            <w:r/>
+            <w:r>
+              <w:rPr>
+                <w:rFonts w:ascii="Microsoft JhengHei" w:hAnsi="Microsoft JhengHei" w:eastAsia="Microsoft JhengHei"/>
+                <w:sz w:val="19"/>
+              </w:rPr>
+              <w:t xml:space="preserve">📸 </w:t>
+            </w:r>
+            <w:r>
+              <w:rPr>
+                <w:rFonts w:ascii="Microsoft JhengHei" w:hAnsi="Microsoft JhengHei" w:eastAsia="Microsoft JhengHei"/>
+                <w:b/>
+                <w:sz w:val="19"/>
+              </w:rPr>
+              <w:t>Highline Galleria 屋頂步道</w:t>
+            </w:r>
+            <w:r>
+              <w:rPr>
+                <w:rFonts w:ascii="Microsoft JhengHei" w:hAnsi="Microsoft JhengHei" w:eastAsia="Microsoft JhengHei"/>
+                <w:sz w:val="19"/>
+              </w:rPr>
+              <w:t>（€12/人，建議 15:30 前排隊）</w:t>
+            </w:r>
+          </w:p>
+        </w:tc>
+      </w:tr>
+      <w:tr>
+        <w:tc>
+          <w:tcPr>
+            <w:tcW w:type="dxa" w:w="4536"/>
+          </w:tcPr>
+          <w:p>
+            <w:r/>
+            <w:r>
+              <w:rPr>
+                <w:rFonts w:ascii="Microsoft JhengHei" w:hAnsi="Microsoft JhengHei" w:eastAsia="Microsoft JhengHei"/>
+                <w:sz w:val="19"/>
+              </w:rPr>
+              <w:t>15:30–16:00</w:t>
+            </w:r>
+          </w:p>
+        </w:tc>
+        <w:tc>
+          <w:tcPr>
+            <w:tcW w:type="dxa" w:w="4536"/>
+          </w:tcPr>
+          <w:p>
+            <w:r/>
+            <w:r>
+              <w:rPr>
+                <w:rFonts w:ascii="Microsoft JhengHei" w:hAnsi="Microsoft JhengHei" w:eastAsia="Microsoft JhengHei"/>
+                <w:sz w:val="19"/>
+              </w:rPr>
+              <w:t xml:space="preserve">☕ </w:t>
+            </w:r>
+            <w:r>
+              <w:rPr>
+                <w:rFonts w:ascii="Microsoft JhengHei" w:hAnsi="Microsoft JhengHei" w:eastAsia="Microsoft JhengHei"/>
+                <w:b/>
+                <w:sz w:val="19"/>
+              </w:rPr>
+              <w:t>La Rinascente 七樓 Obicà / Maio 露台</w:t>
+            </w:r>
+            <w:r>
+              <w:rPr>
+                <w:rFonts w:ascii="Microsoft JhengHei" w:hAnsi="Microsoft JhengHei" w:eastAsia="Microsoft JhengHei"/>
+                <w:sz w:val="19"/>
+              </w:rPr>
+              <w:t>（免費看大教堂尖塔平視角）</w:t>
+            </w:r>
+          </w:p>
+        </w:tc>
+      </w:tr>
+      <w:tr>
+        <w:tc>
+          <w:tcPr>
+            <w:tcW w:type="dxa" w:w="4536"/>
+            <w:shd w:fill="EBF5FB"/>
+          </w:tcPr>
+          <w:p>
+            <w:r/>
+            <w:r>
+              <w:rPr>
+                <w:rFonts w:ascii="Microsoft JhengHei" w:hAnsi="Microsoft JhengHei" w:eastAsia="Microsoft JhengHei"/>
+                <w:sz w:val="19"/>
+              </w:rPr>
+            </w:r>
+            <w:r>
+              <w:rPr>
+                <w:rFonts w:ascii="Microsoft JhengHei" w:hAnsi="Microsoft JhengHei" w:eastAsia="Microsoft JhengHei"/>
+                <w:b/>
+                <w:sz w:val="19"/>
+              </w:rPr>
+              <w:t>16:00–16:40</w:t>
+            </w:r>
+            <w:r>
+              <w:rPr>
+                <w:rFonts w:ascii="Microsoft JhengHei" w:hAnsi="Microsoft JhengHei" w:eastAsia="Microsoft JhengHei"/>
+                <w:sz w:val="19"/>
+              </w:rPr>
+            </w:r>
+          </w:p>
+        </w:tc>
+        <w:tc>
+          <w:tcPr>
+            <w:tcW w:type="dxa" w:w="4536"/>
+            <w:shd w:fill="EBF5FB"/>
+          </w:tcPr>
+          <w:p>
+            <w:r/>
+            <w:r>
+              <w:rPr>
+                <w:rFonts w:ascii="Microsoft JhengHei" w:hAnsi="Microsoft JhengHei" w:eastAsia="Microsoft JhengHei"/>
+                <w:sz w:val="19"/>
+              </w:rPr>
+              <w:t xml:space="preserve">🧳 </w:t>
+            </w:r>
+            <w:r>
+              <w:rPr>
+                <w:rFonts w:ascii="Microsoft JhengHei" w:hAnsi="Microsoft JhengHei" w:eastAsia="Microsoft JhengHei"/>
+                <w:b/>
+                <w:sz w:val="19"/>
+              </w:rPr>
+              <w:t>回住宿整理行李 40 分鐘</w:t>
+            </w:r>
+            <w:r>
+              <w:rPr>
+                <w:rFonts w:ascii="Microsoft JhengHei" w:hAnsi="Microsoft JhengHei" w:eastAsia="Microsoft JhengHei"/>
+                <w:sz w:val="19"/>
+              </w:rPr>
+              <w:t>（先收 70%，留 30% 彈性給晚回住宿後完成）</w:t>
+            </w:r>
+          </w:p>
+        </w:tc>
+      </w:tr>
+      <w:tr>
+        <w:tc>
+          <w:tcPr>
+            <w:tcW w:type="dxa" w:w="4536"/>
+          </w:tcPr>
+          <w:p>
+            <w:r/>
+            <w:r>
+              <w:rPr>
+                <w:rFonts w:ascii="Microsoft JhengHei" w:hAnsi="Microsoft JhengHei" w:eastAsia="Microsoft JhengHei"/>
+                <w:sz w:val="19"/>
+              </w:rPr>
+              <w:t>17:00–17:30</w:t>
+            </w:r>
+          </w:p>
+        </w:tc>
+        <w:tc>
+          <w:tcPr>
+            <w:tcW w:type="dxa" w:w="4536"/>
+          </w:tcPr>
+          <w:p>
+            <w:r/>
+            <w:r>
+              <w:rPr>
+                <w:rFonts w:ascii="Microsoft JhengHei" w:hAnsi="Microsoft JhengHei" w:eastAsia="Microsoft JhengHei"/>
+                <w:sz w:val="19"/>
+              </w:rPr>
+              <w:t>🚶 Brera 區輕鬆散步（Via Brera 巷弄、文青小店）</w:t>
             </w:r>
           </w:p>
         </w:tc>
@@ -6009,7 +6301,7 @@
                 <w:rFonts w:ascii="Microsoft JhengHei" w:hAnsi="Microsoft JhengHei" w:eastAsia="Microsoft JhengHei"/>
                 <w:sz w:val="19"/>
               </w:rPr>
-              <w:t>Aperitivo（Camparino in Galleria）</w:t>
+              <w:t>🍹 Aperitivo（Camparino in Galleria，1915 年 Campari 本家）</w:t>
             </w:r>
           </w:p>
         </w:tc>
@@ -6026,7 +6318,7 @@
                 <w:rFonts w:ascii="Microsoft JhengHei" w:hAnsi="Microsoft JhengHei" w:eastAsia="Microsoft JhengHei"/>
                 <w:sz w:val="19"/>
               </w:rPr>
-              <w:t>19:30–20:30</w:t>
+              <w:t>19:00–19:30</w:t>
             </w:r>
           </w:p>
         </w:tc>
@@ -6041,7 +6333,7 @@
                 <w:rFonts w:ascii="Microsoft JhengHei" w:hAnsi="Microsoft JhengHei" w:eastAsia="Microsoft JhengHei"/>
                 <w:sz w:val="19"/>
               </w:rPr>
-              <w:t>大教堂廣場 / Galleria 看夕陽（6 月日落約 21:10）</w:t>
+              <w:t>🌇 大教堂廣場散步（6 月日落 21:10，此時光線偏柔）</w:t>
             </w:r>
           </w:p>
         </w:tc>
@@ -6059,7 +6351,7 @@
                 <w:rFonts w:ascii="Microsoft JhengHei" w:hAnsi="Microsoft JhengHei" w:eastAsia="Microsoft JhengHei"/>
                 <w:sz w:val="19"/>
               </w:rPr>
-              <w:t>20:30–22:30</w:t>
+              <w:t>20:00–22:30</w:t>
             </w:r>
           </w:p>
         </w:tc>
@@ -6075,7 +6367,7 @@
                 <w:rFonts w:ascii="Microsoft JhengHei" w:hAnsi="Microsoft JhengHei" w:eastAsia="Microsoft JhengHei"/>
                 <w:sz w:val="19"/>
               </w:rPr>
-              <w:t>告別晚餐（Ratanà，需提早訂位）</w:t>
+              <w:t>🍽 告別晚餐（Ratanà，需提早訂位）</w:t>
             </w:r>
           </w:p>
         </w:tc>
@@ -6092,7 +6384,7 @@
                 <w:rFonts w:ascii="Microsoft JhengHei" w:hAnsi="Microsoft JhengHei" w:eastAsia="Microsoft JhengHei"/>
                 <w:sz w:val="19"/>
               </w:rPr>
-              <w:t>23:00 前</w:t>
+              <w:t>22:30–23:00</w:t>
             </w:r>
           </w:p>
         </w:tc>
@@ -6107,7 +6399,7 @@
                 <w:rFonts w:ascii="Microsoft JhengHei" w:hAnsi="Microsoft JhengHei" w:eastAsia="Microsoft JhengHei"/>
                 <w:sz w:val="19"/>
               </w:rPr>
-              <w:t>回住宿，確認行李、護照、登機證</w:t>
+              <w:t>🛏 回住宿完成最後 30% 打包、護照登機證最終確認</w:t>
             </w:r>
           </w:p>
         </w:tc>
@@ -6228,6 +6520,60 @@
           <w:sz w:val="21"/>
         </w:rPr>
         <w:t>，隔天長程飛機</w:t>
+      </w:r>
+    </w:p>
+    <w:p>
+      <w:pPr>
+        <w:ind w:left="454" w:hanging="283"/>
+      </w:pPr>
+      <w:r>
+        <w:rPr>
+          <w:rFonts w:ascii="Microsoft JhengHei" w:hAnsi="Microsoft JhengHei" w:eastAsia="Microsoft JhengHei"/>
+          <w:sz w:val="21"/>
+        </w:rPr>
+        <w:t xml:space="preserve">5. </w:t>
+      </w:r>
+      <w:r>
+        <w:rPr>
+          <w:rFonts w:ascii="Microsoft JhengHei" w:hAnsi="Microsoft JhengHei" w:eastAsia="Microsoft JhengHei"/>
+          <w:b/>
+          <w:sz w:val="21"/>
+        </w:rPr>
+        <w:t>Highline Galleria 出發前確認開放</w:t>
+      </w:r>
+      <w:r>
+        <w:rPr>
+          <w:rFonts w:ascii="Microsoft JhengHei" w:hAnsi="Microsoft JhengHei" w:eastAsia="Microsoft JhengHei"/>
+          <w:sz w:val="21"/>
+        </w:rPr>
+        <w:t>，若維護中可延長 La Rinascente 停留時間</w:t>
+      </w:r>
+    </w:p>
+    <w:p>
+      <w:pPr>
+        <w:ind w:left="454" w:hanging="283"/>
+      </w:pPr>
+      <w:r>
+        <w:rPr>
+          <w:rFonts w:ascii="Microsoft JhengHei" w:hAnsi="Microsoft JhengHei" w:eastAsia="Microsoft JhengHei"/>
+          <w:sz w:val="21"/>
+        </w:rPr>
+        <w:t xml:space="preserve">6. </w:t>
+      </w:r>
+      <w:r>
+        <w:rPr>
+          <w:rFonts w:ascii="Microsoft JhengHei" w:hAnsi="Microsoft JhengHei" w:eastAsia="Microsoft JhengHei"/>
+          <w:b/>
+          <w:sz w:val="21"/>
+        </w:rPr>
+        <w:t>16:00 行李整理只收 70%</w:t>
+      </w:r>
+      <w:r>
+        <w:rPr>
+          <w:rFonts w:ascii="Microsoft JhengHei" w:hAnsi="Microsoft JhengHei" w:eastAsia="Microsoft JhengHei"/>
+          <w:sz w:val="21"/>
+        </w:rPr>
+        <w:t>，留 30% 給晚上回來後的最終打包（隔天 05:30 起床）</w:t>
       </w:r>
     </w:p>
     <w:p>

</xml_diff>

<commit_message>
update: 6/15 升級 Porta del Cielo + 6/18 改 All'Antico Vinaio + 多項一致性修正
- 6/15 Siena 主教座堂改買 PORTA del CIELO 全包通票（€21/人，含 11:30 屋頂導覽）
- 6/18 烏菲茲後午餐從白野豬（週四中午不營業）改成 All'Antico Vinaio schiacciata
- 6/19 加入 19:30 白野豬晚餐（補回 6/18 移出的）
- 加註佛羅倫斯禁食規定警告（Via dei Neri 12:00-15:00 禁人行道蹲坐）
- Day 9 米蘭大教堂時段改為 09:00 進場-12:00 結束（完整 Combo Lift）
- Day 10 機場時間改 07:00 出發 / 08:15 抵達（給足 3hr buffer）
- 加 EUROCOVER 5/7 截止過期警告、費用表加匯率備註、導航加費用按鈕
- 第六章 12:30/2.5h 同步改 12:45/2.75h、簡繁字「杜乔」→「杜喬」
- 經 Gemini + Codex 三方審查 + 部署前機敏資訊雙重審查通過

Co-Authored-By: Claude Opus 4.7 (1M context) <noreply@anthropic.com>
</commit_message>
<xml_diff>
--- a/docs/2026義大利行程規劃.docx
+++ b/docs/2026義大利行程規劃.docx
@@ -1111,7 +1111,7 @@
           <w:rFonts w:ascii="Microsoft JhengHei" w:hAnsi="Microsoft JhengHei" w:eastAsia="Microsoft JhengHei"/>
           <w:sz w:val="21"/>
         </w:rPr>
-        <w:t xml:space="preserve"> 與 EUROCOVER 司導會合，包車自 MXP 出發直達 Siena</w:t>
+        <w:t xml:space="preserve"> 與 EUROCOVER 司導會合，包車自 MXP 出發</w:t>
       </w:r>
     </w:p>
     <w:p>
@@ -1123,7 +1123,7 @@
           <w:rFonts w:ascii="Microsoft JhengHei" w:hAnsi="Microsoft JhengHei" w:eastAsia="Microsoft JhengHei"/>
           <w:sz w:val="21"/>
         </w:rPr>
-        <w:t>• 【已訂】EUROCOVER 包車進老城方案，5 人 EUR 1,310（每人 EUR 262 / TWD 9,615）</w:t>
+        <w:t>• 【已訂】EUROCOVER 商務車包車 10hr/日，5 人 EUR 1,010（每人 EUR 202 / TWD 7,413）</w:t>
       </w:r>
     </w:p>
     <w:p>
@@ -1135,7 +1135,22 @@
           <w:rFonts w:ascii="Microsoft JhengHei" w:hAnsi="Microsoft JhengHei" w:eastAsia="Microsoft JhengHei"/>
           <w:sz w:val="21"/>
         </w:rPr>
-        <w:t>• 全程 3.5~4 小時，途中 Autogrill 休息站停留一次</w:t>
+        <w:t xml:space="preserve">• 路線：MXP → </w:t>
+      </w:r>
+      <w:r>
+        <w:rPr>
+          <w:rFonts w:ascii="Microsoft JhengHei" w:hAnsi="Microsoft JhengHei" w:eastAsia="Microsoft JhengHei"/>
+          <w:b/>
+          <w:sz w:val="21"/>
+        </w:rPr>
+        <w:t>Parma 中停</w:t>
+      </w:r>
+      <w:r>
+        <w:rPr>
+          <w:rFonts w:ascii="Microsoft JhengHei" w:hAnsi="Microsoft JhengHei" w:eastAsia="Microsoft JhengHei"/>
+          <w:sz w:val="21"/>
+        </w:rPr>
+        <w:t xml:space="preserve"> → Siena 住宿</w:t>
       </w:r>
     </w:p>
     <w:p>
@@ -1147,7 +1162,22 @@
           <w:rFonts w:ascii="Microsoft JhengHei" w:hAnsi="Microsoft JhengHei" w:eastAsia="Microsoft JhengHei"/>
           <w:sz w:val="21"/>
         </w:rPr>
-        <w:t>• 司導持 ZTL 通行證，直接送到住宿門口卸貨</w:t>
+        <w:t xml:space="preserve">• </w:t>
+      </w:r>
+      <w:r>
+        <w:rPr>
+          <w:rFonts w:ascii="Microsoft JhengHei" w:hAnsi="Microsoft JhengHei" w:eastAsia="Microsoft JhengHei"/>
+          <w:b/>
+          <w:sz w:val="21"/>
+        </w:rPr>
+        <w:t>中午</w:t>
+      </w:r>
+      <w:r>
+        <w:rPr>
+          <w:rFonts w:ascii="Microsoft JhengHei" w:hAnsi="Microsoft JhengHei" w:eastAsia="Microsoft JhengHei"/>
+          <w:sz w:val="21"/>
+        </w:rPr>
+        <w:t xml:space="preserve"> 抵達 Parma — 美食重鎮中停（火腿、帕馬森乳酪原產地）</w:t>
       </w:r>
     </w:p>
     <w:p>
@@ -1167,68 +1197,14 @@
           <w:b/>
           <w:sz w:val="21"/>
         </w:rPr>
-        <w:t>12:30</w:t>
-      </w:r>
-      <w:r>
-        <w:rPr>
-          <w:rFonts w:ascii="Microsoft JhengHei" w:hAnsi="Microsoft JhengHei" w:eastAsia="Microsoft JhengHei"/>
-          <w:sz w:val="21"/>
-        </w:rPr>
-        <w:t xml:space="preserve"> 抵達 Siena 老城卸行李</w:t>
-      </w:r>
-    </w:p>
-    <w:p>
-      <w:pPr>
-        <w:ind w:left="454" w:hanging="227"/>
-      </w:pPr>
-      <w:r>
-        <w:rPr>
-          <w:rFonts w:ascii="Microsoft JhengHei" w:hAnsi="Microsoft JhengHei" w:eastAsia="Microsoft JhengHei"/>
-          <w:sz w:val="21"/>
-        </w:rPr>
-        <w:t xml:space="preserve">• </w:t>
-      </w:r>
-      <w:r>
-        <w:rPr>
-          <w:rFonts w:ascii="Microsoft JhengHei" w:hAnsi="Microsoft JhengHei" w:eastAsia="Microsoft JhengHei"/>
-          <w:b/>
-          <w:sz w:val="21"/>
-        </w:rPr>
-        <w:t>14:00</w:t>
-      </w:r>
-      <w:r>
-        <w:rPr>
-          <w:rFonts w:ascii="Microsoft JhengHei" w:hAnsi="Microsoft JhengHei" w:eastAsia="Microsoft JhengHei"/>
-          <w:sz w:val="21"/>
-        </w:rPr>
-        <w:t xml:space="preserve"> 房間整理、稍作休息</w:t>
-      </w:r>
-    </w:p>
-    <w:p>
-      <w:pPr>
-        <w:ind w:left="454" w:hanging="227"/>
-      </w:pPr>
-      <w:r>
-        <w:rPr>
-          <w:rFonts w:ascii="Microsoft JhengHei" w:hAnsi="Microsoft JhengHei" w:eastAsia="Microsoft JhengHei"/>
-          <w:sz w:val="21"/>
-        </w:rPr>
-        <w:t xml:space="preserve">• </w:t>
-      </w:r>
-      <w:r>
-        <w:rPr>
-          <w:rFonts w:ascii="Microsoft JhengHei" w:hAnsi="Microsoft JhengHei" w:eastAsia="Microsoft JhengHei"/>
-          <w:b/>
-          <w:sz w:val="21"/>
-        </w:rPr>
-        <w:t>15:00</w:t>
-      </w:r>
-      <w:r>
-        <w:rPr>
-          <w:rFonts w:ascii="Microsoft JhengHei" w:hAnsi="Microsoft JhengHei" w:eastAsia="Microsoft JhengHei"/>
-          <w:sz w:val="21"/>
-        </w:rPr>
-        <w:t xml:space="preserve"> 正式 Check-in，開始 Siena 老城散步</w:t>
+        <w:t>傍晚</w:t>
+      </w:r>
+      <w:r>
+        <w:rPr>
+          <w:rFonts w:ascii="Microsoft JhengHei" w:hAnsi="Microsoft JhengHei" w:eastAsia="Microsoft JhengHei"/>
+          <w:sz w:val="21"/>
+        </w:rPr>
+        <w:t xml:space="preserve"> 抵達 Siena 老城卸行李、Check-in、稍作休息</w:t>
       </w:r>
     </w:p>
     <w:p>
@@ -1533,6 +1509,33 @@
         <w:rPr>
           <w:rFonts w:ascii="Microsoft JhengHei" w:hAnsi="Microsoft JhengHei" w:eastAsia="Microsoft JhengHei"/>
         </w:rPr>
+        <w:t xml:space="preserve"> — 西恩納主教座堂區域（</w:t>
+      </w:r>
+      <w:r>
+        <w:rPr>
+          <w:rFonts w:ascii="Microsoft JhengHei" w:hAnsi="Microsoft JhengHei" w:eastAsia="Microsoft JhengHei"/>
+          <w:b/>
+        </w:rPr>
+        <w:t>全團 PORTA del CIELO 通票 €21/人 × 5 = €105</w:t>
+      </w:r>
+      <w:r>
+        <w:rPr>
+          <w:rFonts w:ascii="Microsoft JhengHei" w:hAnsi="Microsoft JhengHei" w:eastAsia="Microsoft JhengHei"/>
+        </w:rPr>
+        <w:t xml:space="preserve">，已決定 6/15 </w:t>
+      </w:r>
+      <w:r>
+        <w:rPr>
+          <w:rFonts w:ascii="Microsoft JhengHei" w:hAnsi="Microsoft JhengHei" w:eastAsia="Microsoft JhengHei"/>
+          <w:b/>
+        </w:rPr>
+        <w:t>11:30 屋頂導覽英文場</w:t>
+      </w:r>
+      <w:r>
+        <w:rPr>
+          <w:rFonts w:ascii="Microsoft JhengHei" w:hAnsi="Microsoft JhengHei" w:eastAsia="Microsoft JhengHei"/>
+        </w:rPr>
+        <w:t>，5 人同團）</w:t>
       </w:r>
     </w:p>
     <w:p>
@@ -1594,14 +1597,29 @@
           <w:b/>
           <w:sz w:val="21"/>
         </w:rPr>
-        <w:t>10:00</w:t>
-      </w:r>
-      <w:r>
-        <w:rPr>
-          <w:rFonts w:ascii="Microsoft JhengHei" w:hAnsi="Microsoft JhengHei" w:eastAsia="Microsoft JhengHei"/>
-          <w:sz w:val="21"/>
-        </w:rPr>
-        <w:t xml:space="preserve"> 西恩納主教座堂區域：</w:t>
+        <w:t>10:00 - 10:15</w:t>
+      </w:r>
+      <w:r>
+        <w:rPr>
+          <w:rFonts w:ascii="Microsoft JhengHei" w:hAnsi="Microsoft JhengHei" w:eastAsia="Microsoft JhengHei"/>
+          <w:sz w:val="21"/>
+        </w:rPr>
+        <w:t xml:space="preserve"> 🏛 </w:t>
+      </w:r>
+      <w:r>
+        <w:rPr>
+          <w:rFonts w:ascii="Microsoft JhengHei" w:hAnsi="Microsoft JhengHei" w:eastAsia="Microsoft JhengHei"/>
+          <w:b/>
+          <w:sz w:val="21"/>
+        </w:rPr>
+        <w:t>Facciatone 觀景台</w:t>
+      </w:r>
+      <w:r>
+        <w:rPr>
+          <w:rFonts w:ascii="Microsoft JhengHei" w:hAnsi="Microsoft JhengHei" w:eastAsia="Microsoft JhengHei"/>
+          <w:sz w:val="21"/>
+        </w:rPr>
+        <w:t>（~131 階）</w:t>
       </w:r>
     </w:p>
     <w:p>
@@ -1613,22 +1631,7 @@
           <w:rFonts w:ascii="Microsoft JhengHei" w:hAnsi="Microsoft JhengHei" w:eastAsia="Microsoft JhengHei"/>
           <w:sz w:val="21"/>
         </w:rPr>
-        <w:t xml:space="preserve">• </w:t>
-      </w:r>
-      <w:r>
-        <w:rPr>
-          <w:rFonts w:ascii="Microsoft JhengHei" w:hAnsi="Microsoft JhengHei" w:eastAsia="Microsoft JhengHei"/>
-          <w:b/>
-          <w:sz w:val="21"/>
-        </w:rPr>
-        <w:t>西恩納主教座堂（Duomo di Siena）</w:t>
-      </w:r>
-      <w:r>
-        <w:rPr>
-          <w:rFonts w:ascii="Microsoft JhengHei" w:hAnsi="Microsoft JhengHei" w:eastAsia="Microsoft JhengHei"/>
-          <w:sz w:val="21"/>
-        </w:rPr>
-        <w:t xml:space="preserve"> — 門票</w:t>
+        <w:t>• 💡 Siena 人「蓋到一半就放棄」的新教堂擴建殘牆，爬上去能把田野廣場和托斯卡尼丘陵全收進眼底，比曼吉亞塔樓人少很多</w:t>
       </w:r>
     </w:p>
     <w:p>
@@ -1640,7 +1643,37 @@
           <w:rFonts w:ascii="Microsoft JhengHei" w:hAnsi="Microsoft JhengHei" w:eastAsia="Microsoft JhengHei"/>
           <w:sz w:val="21"/>
         </w:rPr>
-        <w:t>• 💡 黑白條紋大理石哥德式教堂，地板上 56 幅大理石鑲嵌畫都是藝術品，Piccolomini 圖書館裡色彩炸裂的濕壁畫必看</w:t>
+        <w:t xml:space="preserve">• </w:t>
+      </w:r>
+      <w:r>
+        <w:rPr>
+          <w:rFonts w:ascii="Microsoft JhengHei" w:hAnsi="Microsoft JhengHei" w:eastAsia="Microsoft JhengHei"/>
+          <w:b/>
+          <w:sz w:val="21"/>
+        </w:rPr>
+        <w:t>10:15 - 10:40</w:t>
+      </w:r>
+      <w:r>
+        <w:rPr>
+          <w:rFonts w:ascii="Microsoft JhengHei" w:hAnsi="Microsoft JhengHei" w:eastAsia="Microsoft JhengHei"/>
+          <w:sz w:val="21"/>
+        </w:rPr>
+        <w:t xml:space="preserve"> 🖼 </w:t>
+      </w:r>
+      <w:r>
+        <w:rPr>
+          <w:rFonts w:ascii="Microsoft JhengHei" w:hAnsi="Microsoft JhengHei" w:eastAsia="Microsoft JhengHei"/>
+          <w:b/>
+          <w:sz w:val="21"/>
+        </w:rPr>
+        <w:t>主教座堂博物館（Museo dell'Opera del Duomo）</w:t>
+      </w:r>
+      <w:r>
+        <w:rPr>
+          <w:rFonts w:ascii="Microsoft JhengHei" w:hAnsi="Microsoft JhengHei" w:eastAsia="Microsoft JhengHei"/>
+          <w:sz w:val="21"/>
+        </w:rPr>
+        <w:t>：杜喬《Maestà》、重點展品</w:t>
       </w:r>
     </w:p>
     <w:p>
@@ -1660,14 +1693,28 @@
           <w:b/>
           <w:sz w:val="21"/>
         </w:rPr>
-        <w:t>博物館</w:t>
-      </w:r>
-      <w:r>
-        <w:rPr>
-          <w:rFonts w:ascii="Microsoft JhengHei" w:hAnsi="Microsoft JhengHei" w:eastAsia="Microsoft JhengHei"/>
-          <w:sz w:val="21"/>
-        </w:rPr>
-        <w:t xml:space="preserve"> — 門票</w:t>
+        <w:t>10:40 - 11:10</w:t>
+      </w:r>
+      <w:r>
+        <w:rPr>
+          <w:rFonts w:ascii="Microsoft JhengHei" w:hAnsi="Microsoft JhengHei" w:eastAsia="Microsoft JhengHei"/>
+          <w:sz w:val="21"/>
+        </w:rPr>
+        <w:t xml:space="preserve"> 🏛 </w:t>
+      </w:r>
+      <w:r>
+        <w:rPr>
+          <w:rFonts w:ascii="Microsoft JhengHei" w:hAnsi="Microsoft JhengHei" w:eastAsia="Microsoft JhengHei"/>
+          <w:b/>
+          <w:sz w:val="21"/>
+        </w:rPr>
+        <w:t>西恩納主教座堂本體 + Piccolomini 圖書館</w:t>
+      </w:r>
+      <w:r>
+        <w:rPr>
+          <w:rFonts w:ascii="Microsoft JhengHei" w:hAnsi="Microsoft JhengHei" w:eastAsia="Microsoft JhengHei"/>
+          <w:sz w:val="21"/>
+        </w:rPr>
       </w:r>
     </w:p>
     <w:p>
@@ -1679,22 +1726,7 @@
           <w:rFonts w:ascii="Microsoft JhengHei" w:hAnsi="Microsoft JhengHei" w:eastAsia="Microsoft JhengHei"/>
           <w:sz w:val="21"/>
         </w:rPr>
-        <w:t xml:space="preserve">• </w:t>
-      </w:r>
-      <w:r>
-        <w:rPr>
-          <w:rFonts w:ascii="Microsoft JhengHei" w:hAnsi="Microsoft JhengHei" w:eastAsia="Microsoft JhengHei"/>
-          <w:b/>
-          <w:sz w:val="21"/>
-        </w:rPr>
-        <w:t>Facciatone 觀景台</w:t>
-      </w:r>
-      <w:r>
-        <w:rPr>
-          <w:rFonts w:ascii="Microsoft JhengHei" w:hAnsi="Microsoft JhengHei" w:eastAsia="Microsoft JhengHei"/>
-          <w:sz w:val="21"/>
-        </w:rPr>
-        <w:t xml:space="preserve"> — 門票</w:t>
+        <w:t>• 💡 黑白條紋大理石哥德式教堂，Piccolomini 圖書館裡色彩鮮明的濕壁畫必看</w:t>
       </w:r>
     </w:p>
     <w:p>
@@ -1706,7 +1738,37 @@
           <w:rFonts w:ascii="Microsoft JhengHei" w:hAnsi="Microsoft JhengHei" w:eastAsia="Microsoft JhengHei"/>
           <w:sz w:val="21"/>
         </w:rPr>
-        <w:t>• 💡 Siena 人「蓋到一半就放棄」的新教堂擴建殘牆，爬上去能把田野廣場和托斯卡尼丘陵全收進眼底，比曼吉亞塔樓人少很多</w:t>
+        <w:t xml:space="preserve">• </w:t>
+      </w:r>
+      <w:r>
+        <w:rPr>
+          <w:rFonts w:ascii="Microsoft JhengHei" w:hAnsi="Microsoft JhengHei" w:eastAsia="Microsoft JhengHei"/>
+          <w:b/>
+          <w:sz w:val="21"/>
+        </w:rPr>
+        <w:t>11:10 - 11:15</w:t>
+      </w:r>
+      <w:r>
+        <w:rPr>
+          <w:rFonts w:ascii="Microsoft JhengHei" w:hAnsi="Microsoft JhengHei" w:eastAsia="Microsoft JhengHei"/>
+          <w:sz w:val="21"/>
+        </w:rPr>
+        <w:t xml:space="preserve"> 🚶 走到屋頂導覽報到處（</w:t>
+      </w:r>
+      <w:r>
+        <w:rPr>
+          <w:rFonts w:ascii="Microsoft JhengHei" w:hAnsi="Microsoft JhengHei" w:eastAsia="Microsoft JhengHei"/>
+          <w:b/>
+          <w:sz w:val="21"/>
+        </w:rPr>
+        <w:t>必須 11:15 前到</w:t>
+      </w:r>
+      <w:r>
+        <w:rPr>
+          <w:rFonts w:ascii="Microsoft JhengHei" w:hAnsi="Microsoft JhengHei" w:eastAsia="Microsoft JhengHei"/>
+          <w:sz w:val="21"/>
+        </w:rPr>
+        <w:t xml:space="preserve"> — 導覽 15 分鐘前報到 + 安檢，出示電子票）</w:t>
       </w:r>
     </w:p>
     <w:p>
@@ -1718,7 +1780,7 @@
           <w:rFonts w:ascii="Microsoft JhengHei" w:hAnsi="Microsoft JhengHei" w:eastAsia="Microsoft JhengHei"/>
           <w:sz w:val="21"/>
         </w:rPr>
-        <w:t xml:space="preserve">• 建議購買 </w:t>
+        <w:t xml:space="preserve">• </w:t>
       </w:r>
       <w:r>
         <w:rPr>
@@ -1726,14 +1788,194 @@
           <w:b/>
           <w:sz w:val="21"/>
         </w:rPr>
-        <w:t>Opa Si Pass</w:t>
-      </w:r>
-      <w:r>
-        <w:rPr>
-          <w:rFonts w:ascii="Microsoft JhengHei" w:hAnsi="Microsoft JhengHei" w:eastAsia="Microsoft JhengHei"/>
-          <w:sz w:val="21"/>
-        </w:rPr>
-        <w:t>（全包票 ~€15-17，含教堂+博物館+觀景台）</w:t>
+        <w:t>11:15 - 11:30</w:t>
+      </w:r>
+      <w:r>
+        <w:rPr>
+          <w:rFonts w:ascii="Microsoft JhengHei" w:hAnsi="Microsoft JhengHei" w:eastAsia="Microsoft JhengHei"/>
+          <w:sz w:val="21"/>
+        </w:rPr>
+        <w:t xml:space="preserve"> ⏳ 報到完成 + 等候集合（15 分鐘 buffer）</w:t>
+      </w:r>
+    </w:p>
+    <w:p>
+      <w:pPr>
+        <w:ind w:left="454" w:hanging="227"/>
+      </w:pPr>
+      <w:r>
+        <w:rPr>
+          <w:rFonts w:ascii="Microsoft JhengHei" w:hAnsi="Microsoft JhengHei" w:eastAsia="Microsoft JhengHei"/>
+          <w:sz w:val="21"/>
+        </w:rPr>
+        <w:t xml:space="preserve">• </w:t>
+      </w:r>
+      <w:r>
+        <w:rPr>
+          <w:rFonts w:ascii="Microsoft JhengHei" w:hAnsi="Microsoft JhengHei" w:eastAsia="Microsoft JhengHei"/>
+          <w:b/>
+          <w:sz w:val="21"/>
+        </w:rPr>
+        <w:t>11:30 - 12:00</w:t>
+      </w:r>
+      <w:r>
+        <w:rPr>
+          <w:rFonts w:ascii="Microsoft JhengHei" w:hAnsi="Microsoft JhengHei" w:eastAsia="Microsoft JhengHei"/>
+          <w:sz w:val="21"/>
+        </w:rPr>
+        <w:t xml:space="preserve"> 🆙 </w:t>
+      </w:r>
+      <w:r>
+        <w:rPr>
+          <w:rFonts w:ascii="Microsoft JhengHei" w:hAnsi="Microsoft JhengHei" w:eastAsia="Microsoft JhengHei"/>
+          <w:b/>
+          <w:sz w:val="21"/>
+        </w:rPr>
+        <w:t>PORTA del CIELO 屋頂導覽</w:t>
+      </w:r>
+      <w:r>
+        <w:rPr>
+          <w:rFonts w:ascii="Microsoft JhengHei" w:hAnsi="Microsoft JhengHei" w:eastAsia="Microsoft JhengHei"/>
+          <w:sz w:val="21"/>
+        </w:rPr>
+        <w:t xml:space="preserve"> 🎫（30 分鐘；實際場次、語言、人數上限以購票系統為準）</w:t>
+      </w:r>
+    </w:p>
+    <w:p>
+      <w:pPr>
+        <w:ind w:left="454" w:hanging="227"/>
+      </w:pPr>
+      <w:r>
+        <w:rPr>
+          <w:rFonts w:ascii="Microsoft JhengHei" w:hAnsi="Microsoft JhengHei" w:eastAsia="Microsoft JhengHei"/>
+          <w:sz w:val="21"/>
+        </w:rPr>
+        <w:t xml:space="preserve">• ⚠ </w:t>
+      </w:r>
+      <w:r>
+        <w:rPr>
+          <w:rFonts w:ascii="Microsoft JhengHei" w:hAnsi="Microsoft JhengHei" w:eastAsia="Microsoft JhengHei"/>
+          <w:b/>
+          <w:sz w:val="21"/>
+        </w:rPr>
+        <w:t>體力警告</w:t>
+      </w:r>
+      <w:r>
+        <w:rPr>
+          <w:rFonts w:ascii="Microsoft JhengHei" w:hAnsi="Microsoft JhengHei" w:eastAsia="Microsoft JhengHei"/>
+          <w:sz w:val="21"/>
+        </w:rPr>
+        <w:t>：屋頂另爬約 70-80 階窄陡石梯，加上 Facciatone 與傍晚曼吉亞塔樓一天約 600+ 階；恐高或膝蓋不適者可放棄屋頂（票款無法退回）</w:t>
+      </w:r>
+    </w:p>
+    <w:p>
+      <w:pPr>
+        <w:ind w:left="454" w:hanging="227"/>
+      </w:pPr>
+      <w:r>
+        <w:rPr>
+          <w:rFonts w:ascii="Microsoft JhengHei" w:hAnsi="Microsoft JhengHei" w:eastAsia="Microsoft JhengHei"/>
+          <w:sz w:val="21"/>
+        </w:rPr>
+        <w:t>• ⚠ 6/15 是「</w:t>
+      </w:r>
+      <w:r>
+        <w:rPr>
+          <w:rFonts w:ascii="Microsoft JhengHei" w:hAnsi="Microsoft JhengHei" w:eastAsia="Microsoft JhengHei"/>
+          <w:b/>
+          <w:sz w:val="21"/>
+        </w:rPr>
+        <w:t>地板覆蓋保護期</w:t>
+      </w:r>
+      <w:r>
+        <w:rPr>
+          <w:rFonts w:ascii="Microsoft JhengHei" w:hAnsi="Microsoft JhengHei" w:eastAsia="Microsoft JhengHei"/>
+          <w:sz w:val="21"/>
+        </w:rPr>
+        <w:t>」（2026 地板開放期為 6/27-7/31、8/18-11/15），看不到 56 幅鑲嵌畫精華；屋頂導覽改看彩繪玻璃近距離 + 星空穹頂 + 拱頂內部結構</w:t>
+      </w:r>
+    </w:p>
+    <w:p>
+      <w:pPr>
+        <w:ind w:left="454" w:hanging="227"/>
+      </w:pPr>
+      <w:r>
+        <w:rPr>
+          <w:rFonts w:ascii="Microsoft JhengHei" w:hAnsi="Microsoft JhengHei" w:eastAsia="Microsoft JhengHei"/>
+          <w:sz w:val="21"/>
+        </w:rPr>
+        <w:t xml:space="preserve">• </w:t>
+      </w:r>
+      <w:r>
+        <w:rPr>
+          <w:rFonts w:ascii="Microsoft JhengHei" w:hAnsi="Microsoft JhengHei" w:eastAsia="Microsoft JhengHei"/>
+          <w:b/>
+          <w:sz w:val="21"/>
+        </w:rPr>
+        <w:t>12:00 - 12:20</w:t>
+      </w:r>
+      <w:r>
+        <w:rPr>
+          <w:rFonts w:ascii="Microsoft JhengHei" w:hAnsi="Microsoft JhengHei" w:eastAsia="Microsoft JhengHei"/>
+          <w:sz w:val="21"/>
+        </w:rPr>
+        <w:t xml:space="preserve"> 🏛 </w:t>
+      </w:r>
+      <w:r>
+        <w:rPr>
+          <w:rFonts w:ascii="Microsoft JhengHei" w:hAnsi="Microsoft JhengHei" w:eastAsia="Microsoft JhengHei"/>
+          <w:b/>
+          <w:sz w:val="21"/>
+        </w:rPr>
+        <w:t>洗禮堂（Battistero）</w:t>
+      </w:r>
+      <w:r>
+        <w:rPr>
+          <w:rFonts w:ascii="Microsoft JhengHei" w:hAnsi="Microsoft JhengHei" w:eastAsia="Microsoft JhengHei"/>
+          <w:sz w:val="21"/>
+        </w:rPr>
+        <w:t>：多那太羅「希律王宴席」青銅浮雕</w:t>
+      </w:r>
+    </w:p>
+    <w:p>
+      <w:pPr>
+        <w:ind w:left="454" w:hanging="227"/>
+      </w:pPr>
+      <w:r>
+        <w:rPr>
+          <w:rFonts w:ascii="Microsoft JhengHei" w:hAnsi="Microsoft JhengHei" w:eastAsia="Microsoft JhengHei"/>
+          <w:sz w:val="21"/>
+        </w:rPr>
+        <w:t xml:space="preserve">• </w:t>
+      </w:r>
+      <w:r>
+        <w:rPr>
+          <w:rFonts w:ascii="Microsoft JhengHei" w:hAnsi="Microsoft JhengHei" w:eastAsia="Microsoft JhengHei"/>
+          <w:b/>
+          <w:sz w:val="21"/>
+        </w:rPr>
+        <w:t>12:20 - 12:40</w:t>
+      </w:r>
+      <w:r>
+        <w:rPr>
+          <w:rFonts w:ascii="Microsoft JhengHei" w:hAnsi="Microsoft JhengHei" w:eastAsia="Microsoft JhengHei"/>
+          <w:sz w:val="21"/>
+        </w:rPr>
+        <w:t xml:space="preserve"> 🏛 </w:t>
+      </w:r>
+      <w:r>
+        <w:rPr>
+          <w:rFonts w:ascii="Microsoft JhengHei" w:hAnsi="Microsoft JhengHei" w:eastAsia="Microsoft JhengHei"/>
+          <w:b/>
+          <w:sz w:val="21"/>
+        </w:rPr>
+        <w:t>地下聖殿（Cripta）</w:t>
+      </w:r>
+      <w:r>
+        <w:rPr>
+          <w:rFonts w:ascii="Microsoft JhengHei" w:hAnsi="Microsoft JhengHei" w:eastAsia="Microsoft JhengHei"/>
+          <w:sz w:val="21"/>
+        </w:rPr>
+        <w:t>（可視體力決定，PASS 已涵蓋）</w:t>
       </w:r>
     </w:p>
     <w:p>
@@ -1773,7 +2015,7 @@
           <w:b/>
           <w:sz w:val="21"/>
         </w:rPr>
-        <w:t>12:30</w:t>
+        <w:t>12:45</w:t>
       </w:r>
       <w:r>
         <w:rPr>
@@ -1795,7 +2037,7 @@
           <w:rFonts w:ascii="Microsoft JhengHei" w:hAnsi="Microsoft JhengHei" w:eastAsia="Microsoft JhengHei"/>
           <w:sz w:val="21"/>
         </w:rPr>
-        <w:t>（在地老牌草根餐館）</w:t>
+        <w:t>（在地老牌草根餐館，因加入 Porta del Cielo 押後 15 分鐘）</w:t>
       </w:r>
     </w:p>
     <w:p>
@@ -1997,7 +2239,22 @@
           <w:rFonts w:ascii="Microsoft JhengHei" w:hAnsi="Microsoft JhengHei" w:eastAsia="Microsoft JhengHei"/>
           <w:sz w:val="21"/>
         </w:rPr>
-        <w:t xml:space="preserve"> — 門票 ~€10，視體力決定是否登頂</w:t>
+        <w:t xml:space="preserve"> — 門票 ~€10，🆕 </w:t>
+      </w:r>
+      <w:r>
+        <w:rPr>
+          <w:rFonts w:ascii="Microsoft JhengHei" w:hAnsi="Microsoft JhengHei" w:eastAsia="Microsoft JhengHei"/>
+          <w:b/>
+          <w:sz w:val="21"/>
+        </w:rPr>
+        <w:t>改為自由參加</w:t>
+      </w:r>
+      <w:r>
+        <w:rPr>
+          <w:rFonts w:ascii="Microsoft JhengHei" w:hAnsi="Microsoft JhengHei" w:eastAsia="Microsoft JhengHei"/>
+          <w:sz w:val="21"/>
+        </w:rPr>
+        <w:t>（一天已累積 ~600 階，膝蓋不適者改在田野廣場斜坡坐著看夕陽 + Aperol Spritz）</w:t>
       </w:r>
     </w:p>
     <w:p>
@@ -2009,7 +2266,7 @@
           <w:rFonts w:ascii="Microsoft JhengHei" w:hAnsi="Microsoft JhengHei" w:eastAsia="Microsoft JhengHei"/>
           <w:sz w:val="21"/>
         </w:rPr>
-        <w:t>• 💡 102 公尺高、義大利第二高中世紀塔樓，塔名來自一位綽號「吃貨」的敲鐘人，爬完 400 階可俯瞰整座 Siena 城</w:t>
+        <w:t>• 💡 102 公尺高、義大利第二高中世紀塔樓，塔名來自一位綽號「吃貨」的敲鐘人，官方寫「約 400 階」可俯瞰整座 Siena 城</w:t>
       </w:r>
     </w:p>
     <w:p>
@@ -3047,14 +3304,14 @@
           <w:b/>
           <w:sz w:val="21"/>
         </w:rPr>
-        <w:t>12:00</w:t>
-      </w:r>
-      <w:r>
-        <w:rPr>
-          <w:rFonts w:ascii="Microsoft JhengHei" w:hAnsi="Microsoft JhengHei" w:eastAsia="Microsoft JhengHei"/>
-          <w:sz w:val="21"/>
-        </w:rPr>
-        <w:t xml:space="preserve"> 🍽 午餐：</w:t>
+        <w:t>11:40</w:t>
+      </w:r>
+      <w:r>
+        <w:rPr>
+          <w:rFonts w:ascii="Microsoft JhengHei" w:hAnsi="Microsoft JhengHei" w:eastAsia="Microsoft JhengHei"/>
+          <w:sz w:val="21"/>
+        </w:rPr>
+        <w:t xml:space="preserve"> 🥖 午餐：</w:t>
       </w:r>
       <w:r>
         <w:rPr>
@@ -3062,14 +3319,206 @@
           <w:b/>
           <w:sz w:val="21"/>
         </w:rPr>
-        <w:t>Osteria del Cinghiale Bianco</w:t>
-      </w:r>
-      <w:r>
-        <w:rPr>
-          <w:rFonts w:ascii="Microsoft JhengHei" w:hAnsi="Microsoft JhengHei" w:eastAsia="Microsoft JhengHei"/>
-          <w:sz w:val="21"/>
-        </w:rPr>
-        <w:t>（白野豬）：跨過老橋即抵達，南岸知名老店。</w:t>
+        <w:t>All'Antico Vinaio</w:t>
+      </w:r>
+      <w:r>
+        <w:rPr>
+          <w:rFonts w:ascii="Microsoft JhengHei" w:hAnsi="Microsoft JhengHei" w:eastAsia="Microsoft JhengHei"/>
+          <w:sz w:val="21"/>
+        </w:rPr>
+        <w:t xml:space="preserve">（Via dei Neri 同街有 65/74/76/78 四個店面，建議選 </w:t>
+      </w:r>
+      <w:r>
+        <w:rPr>
+          <w:rFonts w:ascii="Microsoft JhengHei" w:hAnsi="Microsoft JhengHei" w:eastAsia="Microsoft JhengHei"/>
+          <w:b/>
+          <w:sz w:val="21"/>
+        </w:rPr>
+        <w:t>74r 或 76r 較少排隊</w:t>
+      </w:r>
+      <w:r>
+        <w:rPr>
+          <w:rFonts w:ascii="Microsoft JhengHei" w:hAnsi="Microsoft JhengHei" w:eastAsia="Microsoft JhengHei"/>
+          <w:sz w:val="21"/>
+        </w:rPr>
+        <w:t>，避開最熱門 65r 旗艦店）：烏菲茲走路 3 分鐘抵達。</w:t>
+      </w:r>
+    </w:p>
+    <w:p>
+      <w:pPr>
+        <w:ind w:left="454" w:hanging="227"/>
+      </w:pPr>
+      <w:r>
+        <w:rPr>
+          <w:rFonts w:ascii="Microsoft JhengHei" w:hAnsi="Microsoft JhengHei" w:eastAsia="Microsoft JhengHei"/>
+          <w:sz w:val="21"/>
+        </w:rPr>
+        <w:t xml:space="preserve">• 招牌 Schiacciata 三明治約 </w:t>
+      </w:r>
+      <w:r>
+        <w:rPr>
+          <w:rFonts w:ascii="Microsoft JhengHei" w:hAnsi="Microsoft JhengHei" w:eastAsia="Microsoft JhengHei"/>
+          <w:b/>
+          <w:sz w:val="21"/>
+        </w:rPr>
+        <w:t>€8-€12</w:t>
+      </w:r>
+      <w:r>
+        <w:rPr>
+          <w:rFonts w:ascii="Microsoft JhengHei" w:hAnsi="Microsoft JhengHei" w:eastAsia="Microsoft JhengHei"/>
+          <w:sz w:val="21"/>
+        </w:rPr>
+        <w:t>（部分品項至 €14）+ 紅酒一杯（價格現場確認）</w:t>
+      </w:r>
+    </w:p>
+    <w:p>
+      <w:pPr>
+        <w:ind w:left="454" w:hanging="227"/>
+      </w:pPr>
+      <w:r>
+        <w:rPr>
+          <w:rFonts w:ascii="Microsoft JhengHei" w:hAnsi="Microsoft JhengHei" w:eastAsia="Microsoft JhengHei"/>
+          <w:sz w:val="21"/>
+        </w:rPr>
+        <w:t>• 💡 1991 創立家族店，</w:t>
+      </w:r>
+      <w:r>
+        <w:rPr>
+          <w:rFonts w:ascii="Microsoft JhengHei" w:hAnsi="Microsoft JhengHei" w:eastAsia="Microsoft JhengHei"/>
+          <w:b/>
+          <w:sz w:val="21"/>
+        </w:rPr>
+        <w:t>Gambero Rosso 多次報導的佛羅倫斯街頭美食名店</w:t>
+      </w:r>
+      <w:r>
+        <w:rPr>
+          <w:rFonts w:ascii="Microsoft JhengHei" w:hAnsi="Microsoft JhengHei" w:eastAsia="Microsoft JhengHei"/>
+          <w:sz w:val="21"/>
+        </w:rPr>
+        <w:t>，Saveur 雜誌「世界最佳三明治」推薦</w:t>
+      </w:r>
+    </w:p>
+    <w:p>
+      <w:pPr>
+        <w:ind w:left="454" w:hanging="227"/>
+      </w:pPr>
+      <w:r>
+        <w:rPr>
+          <w:rFonts w:ascii="Microsoft JhengHei" w:hAnsi="Microsoft JhengHei" w:eastAsia="Microsoft JhengHei"/>
+          <w:sz w:val="21"/>
+        </w:rPr>
+        <w:t>• ⚠ 原訂白野豬週四中午本來就不營業（cinghialebianco.net/contatti 官方確認），改到 6/19 晚餐</w:t>
+      </w:r>
+    </w:p>
+    <w:p>
+      <w:pPr>
+        <w:ind w:left="454" w:hanging="227"/>
+      </w:pPr>
+      <w:r>
+        <w:rPr>
+          <w:rFonts w:ascii="Microsoft JhengHei" w:hAnsi="Microsoft JhengHei" w:eastAsia="Microsoft JhengHei"/>
+          <w:sz w:val="21"/>
+        </w:rPr>
+        <w:t xml:space="preserve">• ⚠ </w:t>
+      </w:r>
+      <w:r>
+        <w:rPr>
+          <w:rFonts w:ascii="Microsoft JhengHei" w:hAnsi="Microsoft JhengHei" w:eastAsia="Microsoft JhengHei"/>
+          <w:b/>
+          <w:sz w:val="21"/>
+        </w:rPr>
+        <w:t>重要：佛羅倫斯禁食規定</w:t>
+      </w:r>
+      <w:r>
+        <w:rPr>
+          <w:rFonts w:ascii="Microsoft JhengHei" w:hAnsi="Microsoft JhengHei" w:eastAsia="Microsoft JhengHei"/>
+          <w:sz w:val="21"/>
+        </w:rPr>
+        <w:t xml:space="preserve">：Via dei Neri、Piazzale degli Uffizi 等熱門路段 12:00-15:00 </w:t>
+      </w:r>
+      <w:r>
+        <w:rPr>
+          <w:rFonts w:ascii="Microsoft JhengHei" w:hAnsi="Microsoft JhengHei" w:eastAsia="Microsoft JhengHei"/>
+          <w:b/>
+          <w:sz w:val="21"/>
+        </w:rPr>
+        <w:t>禁止在人行道、店門口、廣場階梯蹲坐進食</w:t>
+      </w:r>
+      <w:r>
+        <w:rPr>
+          <w:rFonts w:ascii="Microsoft JhengHei" w:hAnsi="Microsoft JhengHei" w:eastAsia="Microsoft JhengHei"/>
+          <w:sz w:val="21"/>
+        </w:rPr>
+        <w:t xml:space="preserve">，違者罰款。拿三明治後請走到 </w:t>
+      </w:r>
+      <w:r>
+        <w:rPr>
+          <w:rFonts w:ascii="Microsoft JhengHei" w:hAnsi="Microsoft JhengHei" w:eastAsia="Microsoft JhengHei"/>
+          <w:b/>
+          <w:sz w:val="21"/>
+        </w:rPr>
+        <w:t>阿諾河邊 Lungarno</w:t>
+      </w:r>
+      <w:r>
+        <w:rPr>
+          <w:rFonts w:ascii="Microsoft JhengHei" w:hAnsi="Microsoft JhengHei" w:eastAsia="Microsoft JhengHei"/>
+          <w:sz w:val="21"/>
+        </w:rPr>
+        <w:t>（沿河護欄外側）或共和廣場（Piazza della Repubblica）長椅，找不妨礙通行的位置吃</w:t>
+      </w:r>
+    </w:p>
+    <w:p>
+      <w:pPr>
+        <w:ind w:left="454" w:hanging="227"/>
+      </w:pPr>
+      <w:r>
+        <w:rPr>
+          <w:rFonts w:ascii="Microsoft JhengHei" w:hAnsi="Microsoft JhengHei" w:eastAsia="Microsoft JhengHei"/>
+          <w:sz w:val="21"/>
+        </w:rPr>
+        <w:t>• 必試 5 款分食：</w:t>
+      </w:r>
+      <w:r>
+        <w:rPr>
+          <w:rFonts w:ascii="Microsoft JhengHei" w:hAnsi="Microsoft JhengHei" w:eastAsia="Microsoft JhengHei"/>
+          <w:b/>
+          <w:sz w:val="21"/>
+        </w:rPr>
+        <w:t>La Favolosa</w:t>
+      </w:r>
+      <w:r>
+        <w:rPr>
+          <w:rFonts w:ascii="Microsoft JhengHei" w:hAnsi="Microsoft JhengHei" w:eastAsia="Microsoft JhengHei"/>
+          <w:sz w:val="21"/>
+        </w:rPr>
+        <w:t>（開心果奶油+佩科里諾+肉腸）、</w:t>
+      </w:r>
+      <w:r>
+        <w:rPr>
+          <w:rFonts w:ascii="Microsoft JhengHei" w:hAnsi="Microsoft JhengHei" w:eastAsia="Microsoft JhengHei"/>
+          <w:b/>
+          <w:sz w:val="21"/>
+        </w:rPr>
+        <w:t>La Boss</w:t>
+      </w:r>
+      <w:r>
+        <w:rPr>
+          <w:rFonts w:ascii="Microsoft JhengHei" w:hAnsi="Microsoft JhengHei" w:eastAsia="Microsoft JhengHei"/>
+          <w:sz w:val="21"/>
+        </w:rPr>
+        <w:t>（托斯卡尼火腿+佩科里諾+松露醬）、La Paradiso、La Inferno、La Dante</w:t>
+      </w:r>
+    </w:p>
+    <w:p>
+      <w:pPr>
+        <w:ind w:left="454" w:hanging="227"/>
+      </w:pPr>
+      <w:r>
+        <w:rPr>
+          <w:rFonts w:ascii="Microsoft JhengHei" w:hAnsi="Microsoft JhengHei" w:eastAsia="Microsoft JhengHei"/>
+          <w:sz w:val="21"/>
+        </w:rPr>
+        <w:t>• 🍷 紅酒規矩：結帳時加點 → 拿杯子去酒桶區自己倒（店員通常不代倒）→ 倒完即離開酒桶區（不要擋後面的人）</w:t>
       </w:r>
     </w:p>
     <w:p>
@@ -3715,7 +4164,7 @@
           <w:b/>
           <w:sz w:val="21"/>
         </w:rPr>
-        <w:t>18:30</w:t>
+        <w:t>18:00 - 19:00</w:t>
       </w:r>
       <w:r>
         <w:rPr>
@@ -3737,7 +4186,103 @@
           <w:rFonts w:ascii="Microsoft JhengHei" w:hAnsi="Microsoft JhengHei" w:eastAsia="Microsoft JhengHei"/>
           <w:sz w:val="21"/>
         </w:rPr>
-        <w:t>（酒窗體驗）：南岸著名的紅酒窗口。</w:t>
+        <w:t>（酒窗體驗）：南岸著名的紅酒窗口（提前 30 分鐘，當開胃酒）</w:t>
+      </w:r>
+    </w:p>
+    <w:p>
+      <w:pPr>
+        <w:ind w:left="454" w:hanging="227"/>
+      </w:pPr>
+      <w:r>
+        <w:rPr>
+          <w:rFonts w:ascii="Microsoft JhengHei" w:hAnsi="Microsoft JhengHei" w:eastAsia="Microsoft JhengHei"/>
+          <w:sz w:val="21"/>
+        </w:rPr>
+        <w:t xml:space="preserve">• </w:t>
+      </w:r>
+      <w:r>
+        <w:rPr>
+          <w:rFonts w:ascii="Microsoft JhengHei" w:hAnsi="Microsoft JhengHei" w:eastAsia="Microsoft JhengHei"/>
+          <w:b/>
+          <w:sz w:val="21"/>
+        </w:rPr>
+        <w:t>19:30</w:t>
+      </w:r>
+      <w:r>
+        <w:rPr>
+          <w:rFonts w:ascii="Microsoft JhengHei" w:hAnsi="Microsoft JhengHei" w:eastAsia="Microsoft JhengHei"/>
+          <w:sz w:val="21"/>
+        </w:rPr>
+        <w:t xml:space="preserve"> 🍽 晚餐：</w:t>
+      </w:r>
+      <w:r>
+        <w:rPr>
+          <w:rFonts w:ascii="Microsoft JhengHei" w:hAnsi="Microsoft JhengHei" w:eastAsia="Microsoft JhengHei"/>
+          <w:b/>
+          <w:sz w:val="21"/>
+        </w:rPr>
+        <w:t>Osteria del Cinghiale Bianco</w:t>
+      </w:r>
+      <w:r>
+        <w:rPr>
+          <w:rFonts w:ascii="Microsoft JhengHei" w:hAnsi="Microsoft JhengHei" w:eastAsia="Microsoft JhengHei"/>
+          <w:sz w:val="21"/>
+        </w:rPr>
+        <w:t>（白野豬）：南岸知名老店，野豬肉醬寬扁麵 + 佛羅倫斯丁骨牛排</w:t>
+      </w:r>
+    </w:p>
+    <w:p>
+      <w:pPr>
+        <w:ind w:left="454" w:hanging="227"/>
+      </w:pPr>
+      <w:r>
+        <w:rPr>
+          <w:rFonts w:ascii="Microsoft JhengHei" w:hAnsi="Microsoft JhengHei" w:eastAsia="Microsoft JhengHei"/>
+          <w:sz w:val="21"/>
+        </w:rPr>
+        <w:t>• 💡 原訂 6/18 中午但</w:t>
+      </w:r>
+      <w:r>
+        <w:rPr>
+          <w:rFonts w:ascii="Microsoft JhengHei" w:hAnsi="Microsoft JhengHei" w:eastAsia="Microsoft JhengHei"/>
+          <w:b/>
+          <w:sz w:val="21"/>
+        </w:rPr>
+        <w:t>週四中午不營業（官方確認）</w:t>
+      </w:r>
+      <w:r>
+        <w:rPr>
+          <w:rFonts w:ascii="Microsoft JhengHei" w:hAnsi="Microsoft JhengHei" w:eastAsia="Microsoft JhengHei"/>
+          <w:sz w:val="21"/>
+        </w:rPr>
+        <w:t>，挪到 6/19 晚餐 — 週五晚正常營業</w:t>
+      </w:r>
+    </w:p>
+    <w:p>
+      <w:pPr>
+        <w:ind w:left="454" w:hanging="227"/>
+      </w:pPr>
+      <w:r>
+        <w:rPr>
+          <w:rFonts w:ascii="Microsoft JhengHei" w:hAnsi="Microsoft JhengHei" w:eastAsia="Microsoft JhengHei"/>
+          <w:sz w:val="21"/>
+        </w:rPr>
+        <w:t xml:space="preserve">• ⚠ 建議 </w:t>
+      </w:r>
+      <w:r>
+        <w:rPr>
+          <w:rFonts w:ascii="Microsoft JhengHei" w:hAnsi="Microsoft JhengHei" w:eastAsia="Microsoft JhengHei"/>
+          <w:b/>
+          <w:sz w:val="21"/>
+        </w:rPr>
+        <w:t>5/30 前</w:t>
+      </w:r>
+      <w:r>
+        <w:rPr>
+          <w:rFonts w:ascii="Microsoft JhengHei" w:hAnsi="Microsoft JhengHei" w:eastAsia="Microsoft JhengHei"/>
+          <w:sz w:val="21"/>
+        </w:rPr>
+        <w:t>訂位（5 人桌，旺季熱門）</w:t>
       </w:r>
     </w:p>
     <w:p>
@@ -4655,7 +5200,7 @@
           <w:b/>
           <w:sz w:val="21"/>
         </w:rPr>
-        <w:t>09:00 - 09:30</w:t>
+        <w:t>09:00 進場 - 約 12:00 結束</w:t>
       </w:r>
       <w:r>
         <w:rPr>
@@ -4678,6 +5223,60 @@
           <w:sz w:val="21"/>
         </w:rPr>
         <w:t xml:space="preserve"> 🎫 已訂：Combo Lift x5</w:t>
+      </w:r>
+    </w:p>
+    <w:p>
+      <w:pPr>
+        <w:ind w:left="454" w:hanging="227"/>
+      </w:pPr>
+      <w:r>
+        <w:rPr>
+          <w:rFonts w:ascii="Microsoft JhengHei" w:hAnsi="Microsoft JhengHei" w:eastAsia="Microsoft JhengHei"/>
+          <w:sz w:val="21"/>
+        </w:rPr>
+        <w:t xml:space="preserve">• </w:t>
+      </w:r>
+      <w:r>
+        <w:rPr>
+          <w:rFonts w:ascii="Microsoft JhengHei" w:hAnsi="Microsoft JhengHei" w:eastAsia="Microsoft JhengHei"/>
+          <w:b/>
+          <w:sz w:val="21"/>
+        </w:rPr>
+        <w:t>預約入場時段：09:00-09:30</w:t>
+      </w:r>
+      <w:r>
+        <w:rPr>
+          <w:rFonts w:ascii="Microsoft JhengHei" w:hAnsi="Microsoft JhengHei" w:eastAsia="Microsoft JhengHei"/>
+          <w:sz w:val="21"/>
+        </w:rPr>
+        <w:t>（必須在此時間區間內進場，逾時無法遞補）</w:t>
+      </w:r>
+    </w:p>
+    <w:p>
+      <w:pPr>
+        <w:ind w:left="454" w:hanging="227"/>
+      </w:pPr>
+      <w:r>
+        <w:rPr>
+          <w:rFonts w:ascii="Microsoft JhengHei" w:hAnsi="Microsoft JhengHei" w:eastAsia="Microsoft JhengHei"/>
+          <w:sz w:val="21"/>
+        </w:rPr>
+        <w:t xml:space="preserve">• </w:t>
+      </w:r>
+      <w:r>
+        <w:rPr>
+          <w:rFonts w:ascii="Microsoft JhengHei" w:hAnsi="Microsoft JhengHei" w:eastAsia="Microsoft JhengHei"/>
+          <w:b/>
+          <w:sz w:val="21"/>
+        </w:rPr>
+        <w:t>完整參觀流程</w:t>
+      </w:r>
+      <w:r>
+        <w:rPr>
+          <w:rFonts w:ascii="Microsoft JhengHei" w:hAnsi="Microsoft JhengHei" w:eastAsia="Microsoft JhengHei"/>
+          <w:sz w:val="21"/>
+        </w:rPr>
+        <w:t>：教堂內部（30-45 分）→ 屋頂露台（電梯上、樓梯下，60-75 分）→ 大教堂博物館（45 分）→ San Gottardo 教堂（15 分），預計約 12:00 結束</w:t>
       </w:r>
     </w:p>
     <w:p>
@@ -6482,14 +7081,14 @@
           <w:b/>
           <w:sz w:val="21"/>
         </w:rPr>
-        <w:t>隔天 07:30 要出發前往 Malpensa</w:t>
-      </w:r>
-      <w:r>
-        <w:rPr>
-          <w:rFonts w:ascii="Microsoft JhengHei" w:hAnsi="Microsoft JhengHei" w:eastAsia="Microsoft JhengHei"/>
-          <w:sz w:val="21"/>
-        </w:rPr>
-        <w:t>，建議 22:30 前回住宿確認行李</w:t>
+        <w:t>隔天 07:00 要出發前往 Malpensa</w:t>
+      </w:r>
+      <w:r>
+        <w:rPr>
+          <w:rFonts w:ascii="Microsoft JhengHei" w:hAnsi="Microsoft JhengHei" w:eastAsia="Microsoft JhengHei"/>
+          <w:sz w:val="21"/>
+        </w:rPr>
+        <w:t>（08:15 前抵達機場），建議 22:30 前回住宿確認行李</w:t>
       </w:r>
     </w:p>
     <w:p>
@@ -6672,14 +7271,14 @@
           <w:b/>
           <w:sz w:val="21"/>
         </w:rPr>
-        <w:t>上午</w:t>
-      </w:r>
-      <w:r>
-        <w:rPr>
-          <w:rFonts w:ascii="Microsoft JhengHei" w:hAnsi="Microsoft JhengHei" w:eastAsia="Microsoft JhengHei"/>
-          <w:sz w:val="21"/>
-        </w:rPr>
-        <w:t xml:space="preserve"> 退房，最後檢查行李</w:t>
+        <w:t>05:30</w:t>
+      </w:r>
+      <w:r>
+        <w:rPr>
+          <w:rFonts w:ascii="Microsoft JhengHei" w:hAnsi="Microsoft JhengHei" w:eastAsia="Microsoft JhengHei"/>
+          <w:sz w:val="21"/>
+        </w:rPr>
+        <w:t xml:space="preserve"> 起床（提早起床避免凌晨手忙腳亂）</w:t>
       </w:r>
     </w:p>
     <w:p>
@@ -6699,14 +7298,14 @@
           <w:b/>
           <w:sz w:val="21"/>
         </w:rPr>
-        <w:t>07:30～08:00</w:t>
-      </w:r>
-      <w:r>
-        <w:rPr>
-          <w:rFonts w:ascii="Microsoft JhengHei" w:hAnsi="Microsoft JhengHei" w:eastAsia="Microsoft JhengHei"/>
-          <w:sz w:val="21"/>
-        </w:rPr>
-        <w:t xml:space="preserve"> 出發前往 Malpensa 機場</w:t>
+        <w:t>06:00 - 06:50</w:t>
+      </w:r>
+      <w:r>
+        <w:rPr>
+          <w:rFonts w:ascii="Microsoft JhengHei" w:hAnsi="Microsoft JhengHei" w:eastAsia="Microsoft JhengHei"/>
+          <w:sz w:val="21"/>
+        </w:rPr>
+        <w:t xml:space="preserve"> 完成最後 30% 打包、退房、最後檢查行李</w:t>
       </w:r>
     </w:p>
     <w:p>
@@ -6718,7 +7317,22 @@
           <w:rFonts w:ascii="Microsoft JhengHei" w:hAnsi="Microsoft JhengHei" w:eastAsia="Microsoft JhengHei"/>
           <w:sz w:val="21"/>
         </w:rPr>
-        <w:t>• 選項 A：Malpensa Express 火車（約 52 分鐘，€15/人）— 建議搭 07:25 或 07:55 班次</w:t>
+        <w:t xml:space="preserve">• </w:t>
+      </w:r>
+      <w:r>
+        <w:rPr>
+          <w:rFonts w:ascii="Microsoft JhengHei" w:hAnsi="Microsoft JhengHei" w:eastAsia="Microsoft JhengHei"/>
+          <w:b/>
+          <w:sz w:val="21"/>
+        </w:rPr>
+        <w:t>07:00</w:t>
+      </w:r>
+      <w:r>
+        <w:rPr>
+          <w:rFonts w:ascii="Microsoft JhengHei" w:hAnsi="Microsoft JhengHei" w:eastAsia="Microsoft JhengHei"/>
+          <w:sz w:val="21"/>
+        </w:rPr>
+        <w:t xml:space="preserve"> 出發前往 Malpensa 機場</w:t>
       </w:r>
     </w:p>
     <w:p>
@@ -6730,7 +7344,22 @@
           <w:rFonts w:ascii="Microsoft JhengHei" w:hAnsi="Microsoft JhengHei" w:eastAsia="Microsoft JhengHei"/>
           <w:sz w:val="21"/>
         </w:rPr>
-        <w:t>• 選項 B：機場巴士（約 50 分鐘，€10/人）</w:t>
+        <w:t xml:space="preserve">• 🥇 </w:t>
+      </w:r>
+      <w:r>
+        <w:rPr>
+          <w:rFonts w:ascii="Microsoft JhengHei" w:hAnsi="Microsoft JhengHei" w:eastAsia="Microsoft JhengHei"/>
+          <w:b/>
+          <w:sz w:val="21"/>
+        </w:rPr>
+        <w:t>選項 A（5 人團體推薦）</w:t>
+      </w:r>
+      <w:r>
+        <w:rPr>
+          <w:rFonts w:ascii="Microsoft JhengHei" w:hAnsi="Microsoft JhengHei" w:eastAsia="Microsoft JhengHei"/>
+          <w:sz w:val="21"/>
+        </w:rPr>
+        <w:t>：包車（固定費率約 €110）— 不用搬行李上下車，最省心；建議前一晚預訂</w:t>
       </w:r>
     </w:p>
     <w:p>
@@ -6742,7 +7371,22 @@
           <w:rFonts w:ascii="Microsoft JhengHei" w:hAnsi="Microsoft JhengHei" w:eastAsia="Microsoft JhengHei"/>
           <w:sz w:val="21"/>
         </w:rPr>
-        <w:t>• 選項 C：包車（固定費率約 €110）</w:t>
+        <w:t xml:space="preserve">• 選項 B：Malpensa Express 火車（約 52 分鐘，€15/人）— 建議搭 </w:t>
+      </w:r>
+      <w:r>
+        <w:rPr>
+          <w:rFonts w:ascii="Microsoft JhengHei" w:hAnsi="Microsoft JhengHei" w:eastAsia="Microsoft JhengHei"/>
+          <w:b/>
+          <w:sz w:val="21"/>
+        </w:rPr>
+        <w:t>07:25 班次</w:t>
+      </w:r>
+      <w:r>
+        <w:rPr>
+          <w:rFonts w:ascii="Microsoft JhengHei" w:hAnsi="Microsoft JhengHei" w:eastAsia="Microsoft JhengHei"/>
+          <w:sz w:val="21"/>
+        </w:rPr>
+        <w:t>（保守），備案 07:55；需自行搬行李上下車與月台轉乘</w:t>
       </w:r>
     </w:p>
     <w:p>
@@ -6754,6 +7398,18 @@
           <w:rFonts w:ascii="Microsoft JhengHei" w:hAnsi="Microsoft JhengHei" w:eastAsia="Microsoft JhengHei"/>
           <w:sz w:val="21"/>
         </w:rPr>
+        <w:t>• 選項 C：機場巴士（約 50 分鐘，€10/人）— 最便宜但行李空間有限</w:t>
+      </w:r>
+    </w:p>
+    <w:p>
+      <w:pPr>
+        <w:ind w:left="454" w:hanging="227"/>
+      </w:pPr>
+      <w:r>
+        <w:rPr>
+          <w:rFonts w:ascii="Microsoft JhengHei" w:hAnsi="Microsoft JhengHei" w:eastAsia="Microsoft JhengHei"/>
+          <w:sz w:val="21"/>
+        </w:rPr>
         <w:t xml:space="preserve">• </w:t>
       </w:r>
       <w:r>
@@ -6762,14 +7418,95 @@
           <w:b/>
           <w:sz w:val="21"/>
         </w:rPr>
-        <w:t>09:00～09:30</w:t>
-      </w:r>
-      <w:r>
-        <w:rPr>
-          <w:rFonts w:ascii="Microsoft JhengHei" w:hAnsi="Microsoft JhengHei" w:eastAsia="Microsoft JhengHei"/>
-          <w:sz w:val="21"/>
-        </w:rPr>
-        <w:t xml:space="preserve"> 抵達機場，辦理報到、退稅</w:t>
+        <w:t>約 08:15</w:t>
+      </w:r>
+      <w:r>
+        <w:rPr>
+          <w:rFonts w:ascii="Microsoft JhengHei" w:hAnsi="Microsoft JhengHei" w:eastAsia="Microsoft JhengHei"/>
+          <w:sz w:val="21"/>
+        </w:rPr>
+        <w:t xml:space="preserve"> 抵達機場，辦理報到、退稅、託運</w:t>
+      </w:r>
+    </w:p>
+    <w:p>
+      <w:pPr>
+        <w:ind w:left="454" w:hanging="227"/>
+      </w:pPr>
+      <w:r>
+        <w:rPr>
+          <w:rFonts w:ascii="Microsoft JhengHei" w:hAnsi="Microsoft JhengHei" w:eastAsia="Microsoft JhengHei"/>
+          <w:sz w:val="21"/>
+        </w:rPr>
+        <w:t xml:space="preserve">• ⚠ </w:t>
+      </w:r>
+      <w:r>
+        <w:rPr>
+          <w:rFonts w:ascii="Microsoft JhengHei" w:hAnsi="Microsoft JhengHei" w:eastAsia="Microsoft JhengHei"/>
+          <w:b/>
+          <w:sz w:val="21"/>
+        </w:rPr>
+        <w:t>5 人 + 國際線 + 退稅</w:t>
+      </w:r>
+      <w:r>
+        <w:rPr>
+          <w:rFonts w:ascii="Microsoft JhengHei" w:hAnsi="Microsoft JhengHei" w:eastAsia="Microsoft JhengHei"/>
+          <w:sz w:val="21"/>
+        </w:rPr>
+        <w:t xml:space="preserve">至少需 </w:t>
+      </w:r>
+      <w:r>
+        <w:rPr>
+          <w:rFonts w:ascii="Microsoft JhengHei" w:hAnsi="Microsoft JhengHei" w:eastAsia="Microsoft JhengHei"/>
+          <w:b/>
+          <w:sz w:val="21"/>
+        </w:rPr>
+        <w:t>3 小時 buffer</w:t>
+      </w:r>
+      <w:r>
+        <w:rPr>
+          <w:rFonts w:ascii="Microsoft JhengHei" w:hAnsi="Microsoft JhengHei" w:eastAsia="Microsoft JhengHei"/>
+          <w:sz w:val="21"/>
+        </w:rPr>
+        <w:t>，務必 08:15 前抵達；長榮櫃台一般起飛前 50 分鐘關櫃</w:t>
+      </w:r>
+    </w:p>
+    <w:p>
+      <w:pPr>
+        <w:ind w:left="454" w:hanging="227"/>
+      </w:pPr>
+      <w:r>
+        <w:rPr>
+          <w:rFonts w:ascii="Microsoft JhengHei" w:hAnsi="Microsoft JhengHei" w:eastAsia="Microsoft JhengHei"/>
+          <w:sz w:val="21"/>
+        </w:rPr>
+        <w:t>• 退稅商品先不要託運（海關可能要查看）</w:t>
+      </w:r>
+    </w:p>
+    <w:p>
+      <w:pPr>
+        <w:ind w:left="454" w:hanging="227"/>
+      </w:pPr>
+      <w:r>
+        <w:rPr>
+          <w:rFonts w:ascii="Microsoft JhengHei" w:hAnsi="Microsoft JhengHei" w:eastAsia="Microsoft JhengHei"/>
+          <w:sz w:val="21"/>
+        </w:rPr>
+        <w:t xml:space="preserve">• </w:t>
+      </w:r>
+      <w:r>
+        <w:rPr>
+          <w:rFonts w:ascii="Microsoft JhengHei" w:hAnsi="Microsoft JhengHei" w:eastAsia="Microsoft JhengHei"/>
+          <w:b/>
+          <w:sz w:val="21"/>
+        </w:rPr>
+        <w:t>10:15</w:t>
+      </w:r>
+      <w:r>
+        <w:rPr>
+          <w:rFonts w:ascii="Microsoft JhengHei" w:hAnsi="Microsoft JhengHei" w:eastAsia="Microsoft JhengHei"/>
+          <w:sz w:val="21"/>
+        </w:rPr>
+        <w:t xml:space="preserve"> 通過安檢完畢，登機口候機</w:t>
       </w:r>
     </w:p>
     <w:p>
@@ -7241,7 +7978,7 @@
                 <w:rFonts w:ascii="Microsoft JhengHei" w:hAnsi="Microsoft JhengHei" w:eastAsia="Microsoft JhengHei"/>
                 <w:sz w:val="19"/>
               </w:rPr>
-              <w:t>EUR 1,310 / TWD 48,077</w:t>
+              <w:t>EUR 1,010 / TWD 37,067</w:t>
             </w:r>
           </w:p>
         </w:tc>
@@ -7257,7 +7994,7 @@
                 <w:rFonts w:ascii="Microsoft JhengHei" w:hAnsi="Microsoft JhengHei" w:eastAsia="Microsoft JhengHei"/>
                 <w:sz w:val="19"/>
               </w:rPr>
-              <w:t>MXP → Siena 直達進老城（已訂，每人 €262）</w:t>
+              <w:t>MXP → Parma → Siena（10hr/日，已訂，每人 €202）</w:t>
             </w:r>
           </w:p>
         </w:tc>
@@ -7322,7 +8059,7 @@
                 <w:rFonts w:ascii="Microsoft JhengHei" w:hAnsi="Microsoft JhengHei" w:eastAsia="Microsoft JhengHei"/>
                 <w:sz w:val="19"/>
               </w:rPr>
-              <w:t>烏菲茲美術館 x5</w:t>
+              <w:t>Siena 主教座堂 PORTA del CIELO x5</w:t>
             </w:r>
           </w:p>
         </w:tc>
@@ -7338,6 +8075,54 @@
                 <w:rFonts w:ascii="Microsoft JhengHei" w:hAnsi="Microsoft JhengHei" w:eastAsia="Microsoft JhengHei"/>
                 <w:sz w:val="19"/>
               </w:rPr>
+              <w:t>EUR 105（每人 €21）</w:t>
+            </w:r>
+          </w:p>
+        </w:tc>
+        <w:tc>
+          <w:tcPr>
+            <w:tcW w:type="dxa" w:w="3024"/>
+            <w:shd w:fill="EBF5FB"/>
+          </w:tcPr>
+          <w:p>
+            <w:r/>
+            <w:r>
+              <w:rPr>
+                <w:rFonts w:ascii="Microsoft JhengHei" w:hAnsi="Microsoft JhengHei" w:eastAsia="Microsoft JhengHei"/>
+                <w:sz w:val="19"/>
+              </w:rPr>
+              <w:t>6/15 11:30 屋頂導覽英文場（待訂）</w:t>
+            </w:r>
+          </w:p>
+        </w:tc>
+      </w:tr>
+      <w:tr>
+        <w:tc>
+          <w:tcPr>
+            <w:tcW w:type="dxa" w:w="3024"/>
+          </w:tcPr>
+          <w:p>
+            <w:r/>
+            <w:r>
+              <w:rPr>
+                <w:rFonts w:ascii="Microsoft JhengHei" w:hAnsi="Microsoft JhengHei" w:eastAsia="Microsoft JhengHei"/>
+                <w:sz w:val="19"/>
+              </w:rPr>
+              <w:t>烏菲茲美術館 x5</w:t>
+            </w:r>
+          </w:p>
+        </w:tc>
+        <w:tc>
+          <w:tcPr>
+            <w:tcW w:type="dxa" w:w="3024"/>
+          </w:tcPr>
+          <w:p>
+            <w:r/>
+            <w:r>
+              <w:rPr>
+                <w:rFonts w:ascii="Microsoft JhengHei" w:hAnsi="Microsoft JhengHei" w:eastAsia="Microsoft JhengHei"/>
+                <w:sz w:val="19"/>
+              </w:rPr>
               <w:t>EUR 145（每人 €29）</w:t>
             </w:r>
           </w:p>
@@ -7345,7 +8130,6 @@
         <w:tc>
           <w:tcPr>
             <w:tcW w:type="dxa" w:w="3024"/>
-            <w:shd w:fill="EBF5FB"/>
           </w:tcPr>
           <w:p>
             <w:r/>
@@ -7363,6 +8147,7 @@
         <w:tc>
           <w:tcPr>
             <w:tcW w:type="dxa" w:w="3024"/>
+            <w:shd w:fill="EBF5FB"/>
           </w:tcPr>
           <w:p>
             <w:r/>
@@ -7378,6 +8163,7 @@
         <w:tc>
           <w:tcPr>
             <w:tcW w:type="dxa" w:w="3024"/>
+            <w:shd w:fill="EBF5FB"/>
           </w:tcPr>
           <w:p>
             <w:r/>
@@ -7393,6 +8179,7 @@
         <w:tc>
           <w:tcPr>
             <w:tcW w:type="dxa" w:w="3024"/>
+            <w:shd w:fill="EBF5FB"/>
           </w:tcPr>
           <w:p>
             <w:r/>
@@ -7410,7 +8197,6 @@
         <w:tc>
           <w:tcPr>
             <w:tcW w:type="dxa" w:w="3024"/>
-            <w:shd w:fill="EBF5FB"/>
           </w:tcPr>
           <w:p>
             <w:r/>
@@ -7426,7 +8212,6 @@
         <w:tc>
           <w:tcPr>
             <w:tcW w:type="dxa" w:w="3024"/>
-            <w:shd w:fill="EBF5FB"/>
           </w:tcPr>
           <w:p>
             <w:r/>
@@ -7442,7 +8227,6 @@
         <w:tc>
           <w:tcPr>
             <w:tcW w:type="dxa" w:w="3024"/>
-            <w:shd w:fill="EBF5FB"/>
           </w:tcPr>
           <w:p>
             <w:r/>
@@ -7460,6 +8244,40 @@
     <w:p/>
     <w:p>
       <w:pPr>
+        <w:ind w:left="283"/>
+        <w:pBdr>
+          <w:left w:val="single" w:sz="12" w:space="4" w:color="2E86C1"/>
+        </w:pBdr>
+        <w:shd w:fill="EBF5FB"/>
+      </w:pPr>
+      <w:r>
+        <w:rPr>
+          <w:rFonts w:ascii="Microsoft JhengHei" w:hAnsi="Microsoft JhengHei" w:eastAsia="Microsoft JhengHei"/>
+          <w:color w:val="5D6D7E"/>
+          <w:sz w:val="21"/>
+        </w:rPr>
+        <w:t xml:space="preserve">💱 </w:t>
+      </w:r>
+      <w:r>
+        <w:rPr>
+          <w:rFonts w:ascii="Microsoft JhengHei" w:hAnsi="Microsoft JhengHei" w:eastAsia="Microsoft JhengHei"/>
+          <w:b/>
+          <w:color w:val="5D6D7E"/>
+          <w:sz w:val="21"/>
+        </w:rPr>
+        <w:t>預估匯率</w:t>
+      </w:r>
+      <w:r>
+        <w:rPr>
+          <w:rFonts w:ascii="Microsoft JhengHei" w:hAnsi="Microsoft JhengHei" w:eastAsia="Microsoft JhengHei"/>
+          <w:color w:val="5D6D7E"/>
+          <w:sz w:val="21"/>
+        </w:rPr>
+        <w:t>：1 EUR ≈ TWD 36.7-37.2（實際以信用卡刷卡日銀行匯率為準，浮動 ±1% 為正常範圍）</w:t>
+      </w:r>
+    </w:p>
+    <w:p>
+      <w:pPr>
         <w:spacing w:before="40" w:after="40"/>
         <w:pBdr>
           <w:bottom w:val="single" w:sz="4" w:space="1" w:color="BDC3C7"/>
@@ -7488,7 +8306,7 @@
           <w:rFonts w:ascii="Microsoft JhengHei" w:hAnsi="Microsoft JhengHei" w:eastAsia="Microsoft JhengHei"/>
           <w:sz w:val="21"/>
         </w:rPr>
-        <w:t>☑ 預訂 6/14 MXP→Siena EUROCOVER 包車（進老城方案 EUR 1,310）✅</w:t>
+        <w:t>☑ 預訂 6/14 MXP→Parma→Siena EUROCOVER 包車（EUR 1,010）✅</w:t>
       </w:r>
     </w:p>
     <w:p>
@@ -7587,7 +8405,7 @@
           <w:rFonts w:ascii="Microsoft JhengHei" w:hAnsi="Microsoft JhengHei" w:eastAsia="Microsoft JhengHei"/>
           <w:sz w:val="21"/>
         </w:rPr>
-        <w:t>☐ 預約百花大教堂圓頂登頂（必須線上預約）</w:t>
+        <w:t>☐ 訂 Siena 主教座堂 PORTA del CIELO 6/15 11:30 屋頂導覽英文場（5 人 €105，5/15 前訂）</w:t>
       </w:r>
     </w:p>
     <w:p>
@@ -7599,7 +8417,7 @@
           <w:rFonts w:ascii="Microsoft JhengHei" w:hAnsi="Microsoft JhengHei" w:eastAsia="Microsoft JhengHei"/>
           <w:sz w:val="21"/>
         </w:rPr>
-        <w:t>☐ 購買義大利 eSIM 或 SIM 卡</w:t>
+        <w:t>☐ 訂 6/19 晚餐 Osteria del Cinghiale Bianco（5 人桌，5/30 前訂位）</w:t>
       </w:r>
     </w:p>
     <w:p>
@@ -7611,7 +8429,7 @@
           <w:rFonts w:ascii="Microsoft JhengHei" w:hAnsi="Microsoft JhengHei" w:eastAsia="Microsoft JhengHei"/>
           <w:sz w:val="21"/>
         </w:rPr>
-        <w:t>☐ 確認護照效期（需 6 個月以上）</w:t>
+        <w:t>☐ 預約百花大教堂圓頂登頂（必須線上預約）</w:t>
       </w:r>
     </w:p>
     <w:p>
@@ -7623,7 +8441,7 @@
           <w:rFonts w:ascii="Microsoft JhengHei" w:hAnsi="Microsoft JhengHei" w:eastAsia="Microsoft JhengHei"/>
           <w:sz w:val="21"/>
         </w:rPr>
-        <w:t>☐ 準備旅平險</w:t>
+        <w:t>☐ 購買義大利 eSIM 或 SIM 卡</w:t>
       </w:r>
     </w:p>
     <w:p>
@@ -7635,7 +8453,7 @@
           <w:rFonts w:ascii="Microsoft JhengHei" w:hAnsi="Microsoft JhengHei" w:eastAsia="Microsoft JhengHei"/>
           <w:sz w:val="21"/>
         </w:rPr>
-        <w:t>☐ 確認信用卡海外刷卡功能開通</w:t>
+        <w:t>☐ 確認護照效期（需 6 個月以上）</w:t>
       </w:r>
     </w:p>
     <w:p>
@@ -7647,7 +8465,7 @@
           <w:rFonts w:ascii="Microsoft JhengHei" w:hAnsi="Microsoft JhengHei" w:eastAsia="Microsoft JhengHei"/>
           <w:sz w:val="21"/>
         </w:rPr>
-        <w:t>☐ 下載離線地圖（Google Maps 義大利地區）</w:t>
+        <w:t>☐ 準備旅平險</w:t>
       </w:r>
     </w:p>
     <w:p>
@@ -7659,7 +8477,7 @@
           <w:rFonts w:ascii="Microsoft JhengHei" w:hAnsi="Microsoft JhengHei" w:eastAsia="Microsoft JhengHei"/>
           <w:sz w:val="21"/>
         </w:rPr>
-        <w:t>☐ 下載 Trenitalia / Italo App（查火車時刻）</w:t>
+        <w:t>☐ 確認信用卡海外刷卡功能開通</w:t>
       </w:r>
     </w:p>
     <w:p>
@@ -7671,7 +8489,31 @@
           <w:rFonts w:ascii="Microsoft JhengHei" w:hAnsi="Microsoft JhengHei" w:eastAsia="Microsoft JhengHei"/>
           <w:sz w:val="21"/>
         </w:rPr>
-        <w:t>☐ 列印門票（烏菲茲美術館、學院美術館、米蘭大教堂）</w:t>
+        <w:t>☐ 下載離線地圖（Google Maps 義大利地區）</w:t>
+      </w:r>
+    </w:p>
+    <w:p>
+      <w:pPr>
+        <w:ind w:left="454" w:hanging="227"/>
+      </w:pPr>
+      <w:r>
+        <w:rPr>
+          <w:rFonts w:ascii="Microsoft JhengHei" w:hAnsi="Microsoft JhengHei" w:eastAsia="Microsoft JhengHei"/>
+          <w:sz w:val="21"/>
+        </w:rPr>
+        <w:t>☐ 下載 Trenitalia / Italo App（查火車時刻）</w:t>
+      </w:r>
+    </w:p>
+    <w:p>
+      <w:pPr>
+        <w:ind w:left="454" w:hanging="227"/>
+      </w:pPr>
+      <w:r>
+        <w:rPr>
+          <w:rFonts w:ascii="Microsoft JhengHei" w:hAnsi="Microsoft JhengHei" w:eastAsia="Microsoft JhengHei"/>
+          <w:sz w:val="21"/>
+        </w:rPr>
+        <w:t>☐ 列印門票（烏菲茲美術館、學院美術館、米蘭大教堂、Siena PORTA del CIELO）</w:t>
       </w:r>
     </w:p>
     <w:p>
@@ -7694,7 +8536,7 @@
           <w:rFonts w:ascii="Microsoft JhengHei" w:hAnsi="Microsoft JhengHei" w:eastAsia="Microsoft JhengHei"/>
           <w:i/>
         </w:rPr>
-        <w:t>最後更新：2026/5/1</w:t>
+        <w:t>最後更新：2026/5/12</w:t>
       </w:r>
       <w:r>
         <w:rPr>

</xml_diff>

<commit_message>
fix: Day 5 三方審查修正 + 加入 Trattoria 4 Leoni 晚餐
三方審查（Claude + Gemini + Codex）抓到的關鍵錯誤：
- 🚨 Spazio Filatelia 原 17:00 會撲空（官方平日 08:20-15:30）→ 移到 14:00-14:45
- 🚨 13 路公車不直回 SMN（為 Piazzale Michelangiolo-Rotonda Barbetti）→ 改 12 路為首選
- 計程車夜間費率 €8.10 → 正確 €7.70 起跳
- 補：5 人需叫 Large Taxi / Van（一般義大利計程車僅 4 人）
- 補：Day 6 圓頂銜接（22:15 前回住宿）
- 補：晚餐須訂位、20:00 前結帳離席

italy-food-guru 推薦晚餐：
- Trattoria 4 Leoni（Piazza della Passera）— Gambero Rosso 歷史榜單，
  12:00-23:00 連續營業（南岸唯一可 19:00 入座），+39 055 218562
- 備案：Il Santo Bevitore（米其林 2026）、Osteria Tripperia Il Magazzino

Co-Authored-By: Claude Opus 4.7 (1M context) <noreply@anthropic.com>
</commit_message>
<xml_diff>
--- a/docs/2026義大利行程規劃.docx
+++ b/docs/2026義大利行程規劃.docx
@@ -3165,7 +3165,7 @@
         <w:pStyle w:val="Heading3"/>
       </w:pPr>
       <w:r>
-        <w:t>Day 5｜6/18（四）— 烏菲茲藝術 → 南岸午餐 → 領主廣場 → 刺繡郵票</w:t>
+        <w:t>Day 5｜6/18（四）— 烏菲茲 → 領主廣場 → 刺繡郵票 → 米開朗基羅廣場夜景</w:t>
       </w:r>
     </w:p>
     <w:p>
@@ -3538,7 +3538,7 @@
           <w:b/>
           <w:sz w:val="21"/>
         </w:rPr>
-        <w:t>13:30</w:t>
+        <w:t>13:30 - 14:00</w:t>
       </w:r>
       <w:r>
         <w:rPr>
@@ -3572,7 +3572,7 @@
           <w:rFonts w:ascii="Microsoft JhengHei" w:hAnsi="Microsoft JhengHei" w:eastAsia="Microsoft JhengHei"/>
           <w:sz w:val="21"/>
         </w:rPr>
-        <w:t>• 💡 佛羅倫斯的政治心臟，露天雕塑多到像沒有圍牆的博物館，舊宮門前站著大衛像複製品，海神噴泉和乘女掠奪雕塑群隨便一個都是教科書等級</w:t>
+        <w:t>• 💡 佛羅倫斯的政治心臟，露天雕塑多到像沒有圍牆的博物館，舊宮門前站著大衛像複製品，海神噴泉和《薩賓婦女的掠奪》雕塑群隨便一個都是教科書等級</w:t>
       </w:r>
     </w:p>
     <w:p>
@@ -3592,14 +3592,44 @@
           <w:b/>
           <w:sz w:val="21"/>
         </w:rPr>
-        <w:t>14:30 - 16:30</w:t>
-      </w:r>
-      <w:r>
-        <w:rPr>
-          <w:rFonts w:ascii="Microsoft JhengHei" w:hAnsi="Microsoft JhengHei" w:eastAsia="Microsoft JhengHei"/>
-          <w:sz w:val="21"/>
-        </w:rPr>
-        <w:t xml:space="preserve"> 💤 回飯店休息（2 小時）。</w:t>
+        <w:t>14:00 - 14:45</w:t>
+      </w:r>
+      <w:r>
+        <w:rPr>
+          <w:rFonts w:ascii="Microsoft JhengHei" w:hAnsi="Microsoft JhengHei" w:eastAsia="Microsoft JhengHei"/>
+          <w:sz w:val="21"/>
+        </w:rPr>
+        <w:t xml:space="preserve"> ✉ </w:t>
+      </w:r>
+      <w:r>
+        <w:rPr>
+          <w:rFonts w:ascii="Microsoft JhengHei" w:hAnsi="Microsoft JhengHei" w:eastAsia="Microsoft JhengHei"/>
+          <w:b/>
+          <w:sz w:val="21"/>
+        </w:rPr>
+        <w:t>Spazio Filatelia Firenze</w:t>
+      </w:r>
+      <w:r>
+        <w:rPr>
+          <w:rFonts w:ascii="Microsoft JhengHei" w:hAnsi="Microsoft JhengHei" w:eastAsia="Microsoft JhengHei"/>
+          <w:sz w:val="21"/>
+        </w:rPr>
+        <w:t>（</w:t>
+      </w:r>
+      <w:r>
+        <w:rPr>
+          <w:rFonts w:ascii="Microsoft JhengHei" w:hAnsi="Microsoft JhengHei" w:eastAsia="Microsoft JhengHei"/>
+          <w:b/>
+          <w:sz w:val="21"/>
+        </w:rPr>
+        <w:t>必須在 15:30 關門前到</w:t>
+      </w:r>
+      <w:r>
+        <w:rPr>
+          <w:rFonts w:ascii="Microsoft JhengHei" w:hAnsi="Microsoft JhengHei" w:eastAsia="Microsoft JhengHei"/>
+          <w:sz w:val="21"/>
+        </w:rPr>
+        <w:t>）</w:t>
       </w:r>
     </w:p>
     <w:p>
@@ -3611,37 +3641,7 @@
           <w:rFonts w:ascii="Microsoft JhengHei" w:hAnsi="Microsoft JhengHei" w:eastAsia="Microsoft JhengHei"/>
           <w:sz w:val="21"/>
         </w:rPr>
-        <w:t xml:space="preserve">• </w:t>
-      </w:r>
-      <w:r>
-        <w:rPr>
-          <w:rFonts w:ascii="Microsoft JhengHei" w:hAnsi="Microsoft JhengHei" w:eastAsia="Microsoft JhengHei"/>
-          <w:b/>
-          <w:sz w:val="21"/>
-        </w:rPr>
-        <w:t>17:00</w:t>
-      </w:r>
-      <w:r>
-        <w:rPr>
-          <w:rFonts w:ascii="Microsoft JhengHei" w:hAnsi="Microsoft JhengHei" w:eastAsia="Microsoft JhengHei"/>
-          <w:sz w:val="21"/>
-        </w:rPr>
-        <w:t xml:space="preserve"> ✉ </w:t>
-      </w:r>
-      <w:r>
-        <w:rPr>
-          <w:rFonts w:ascii="Microsoft JhengHei" w:hAnsi="Microsoft JhengHei" w:eastAsia="Microsoft JhengHei"/>
-          <w:b/>
-          <w:sz w:val="21"/>
-        </w:rPr>
-        <w:t>Spazio Filatelia Firenze</w:t>
-      </w:r>
-      <w:r>
-        <w:rPr>
-          <w:rFonts w:ascii="Microsoft JhengHei" w:hAnsi="Microsoft JhengHei" w:eastAsia="Microsoft JhengHei"/>
-          <w:sz w:val="21"/>
-        </w:rPr>
-        <w:t>：</w:t>
+        <w:t>• 備註：【必逛：買限定刺繡郵票】。Via Pellicceria, 3，距領主廣場步行 3 分鐘</w:t>
       </w:r>
     </w:p>
     <w:p>
@@ -3653,7 +3653,22 @@
           <w:rFonts w:ascii="Microsoft JhengHei" w:hAnsi="Microsoft JhengHei" w:eastAsia="Microsoft JhengHei"/>
           <w:sz w:val="21"/>
         </w:rPr>
-        <w:t>• 備註：【必逛：買限定刺繡郵票】。關鍵字：Spazio Filatelia Firenze。</w:t>
+        <w:t xml:space="preserve">• ⚠ </w:t>
+      </w:r>
+      <w:r>
+        <w:rPr>
+          <w:rFonts w:ascii="Microsoft JhengHei" w:hAnsi="Microsoft JhengHei" w:eastAsia="Microsoft JhengHei"/>
+          <w:b/>
+          <w:sz w:val="21"/>
+        </w:rPr>
+        <w:t>官方營業時間平日 08:20-15:30</w:t>
+      </w:r>
+      <w:r>
+        <w:rPr>
+          <w:rFonts w:ascii="Microsoft JhengHei" w:hAnsi="Microsoft JhengHei" w:eastAsia="Microsoft JhengHei"/>
+          <w:sz w:val="21"/>
+        </w:rPr>
+        <w:t>（週末更早），須在午後完成</w:t>
       </w:r>
     </w:p>
     <w:p>
@@ -3665,7 +3680,37 @@
           <w:rFonts w:ascii="Microsoft JhengHei" w:hAnsi="Microsoft JhengHei" w:eastAsia="Microsoft JhengHei"/>
           <w:sz w:val="21"/>
         </w:rPr>
-        <w:t>• 💡 義大利郵政特色門市，能買到真的用布繡出來的佛羅倫斯限定郵票，可實寄也可收藏，非常獨特又輕便的伴手禮</w:t>
+        <w:t xml:space="preserve">• </w:t>
+      </w:r>
+      <w:r>
+        <w:rPr>
+          <w:rFonts w:ascii="Microsoft JhengHei" w:hAnsi="Microsoft JhengHei" w:eastAsia="Microsoft JhengHei"/>
+          <w:b/>
+          <w:sz w:val="21"/>
+        </w:rPr>
+        <w:t>14:45 - 15:30</w:t>
+      </w:r>
+      <w:r>
+        <w:rPr>
+          <w:rFonts w:ascii="Microsoft JhengHei" w:hAnsi="Microsoft JhengHei" w:eastAsia="Microsoft JhengHei"/>
+          <w:sz w:val="21"/>
+        </w:rPr>
+        <w:t xml:space="preserve"> 🛍 </w:t>
+      </w:r>
+      <w:r>
+        <w:rPr>
+          <w:rFonts w:ascii="Microsoft JhengHei" w:hAnsi="Microsoft JhengHei" w:eastAsia="Microsoft JhengHei"/>
+          <w:b/>
+          <w:sz w:val="21"/>
+        </w:rPr>
+        <w:t>Via dei Calzaiuoli</w:t>
+      </w:r>
+      <w:r>
+        <w:rPr>
+          <w:rFonts w:ascii="Microsoft JhengHei" w:hAnsi="Microsoft JhengHei" w:eastAsia="Microsoft JhengHei"/>
+          <w:sz w:val="21"/>
+        </w:rPr>
+        <w:t>：閒逛名店街 + 拍百花穹頂</w:t>
       </w:r>
     </w:p>
     <w:p>
@@ -3685,29 +3730,14 @@
           <w:b/>
           <w:sz w:val="21"/>
         </w:rPr>
-        <w:t>17:45</w:t>
-      </w:r>
-      <w:r>
-        <w:rPr>
-          <w:rFonts w:ascii="Microsoft JhengHei" w:hAnsi="Microsoft JhengHei" w:eastAsia="Microsoft JhengHei"/>
-          <w:sz w:val="21"/>
-        </w:rPr>
-        <w:t xml:space="preserve"> 🛍 </w:t>
-      </w:r>
-      <w:r>
-        <w:rPr>
-          <w:rFonts w:ascii="Microsoft JhengHei" w:hAnsi="Microsoft JhengHei" w:eastAsia="Microsoft JhengHei"/>
-          <w:b/>
-          <w:sz w:val="21"/>
-        </w:rPr>
-        <w:t>Via dei Calzaiuoli（卡爾查依優歐利大道）</w:t>
-      </w:r>
-      <w:r>
-        <w:rPr>
-          <w:rFonts w:ascii="Microsoft JhengHei" w:hAnsi="Microsoft JhengHei" w:eastAsia="Microsoft JhengHei"/>
-          <w:sz w:val="21"/>
-        </w:rPr>
-        <w:t>：</w:t>
+        <w:t>15:30 - 17:30</w:t>
+      </w:r>
+      <w:r>
+        <w:rPr>
+          <w:rFonts w:ascii="Microsoft JhengHei" w:hAnsi="Microsoft JhengHei" w:eastAsia="Microsoft JhengHei"/>
+          <w:sz w:val="21"/>
+        </w:rPr>
+        <w:t xml:space="preserve"> 💤 回飯店休息（2 小時）。</w:t>
       </w:r>
     </w:p>
     <w:p>
@@ -3719,7 +3749,22 @@
           <w:rFonts w:ascii="Microsoft JhengHei" w:hAnsi="Microsoft JhengHei" w:eastAsia="Microsoft JhengHei"/>
           <w:sz w:val="21"/>
         </w:rPr>
-        <w:t>• 關鍵字： Via dei Calzaiuoli。連結領主廣場與大教堂的名店街。</w:t>
+        <w:t xml:space="preserve">• </w:t>
+      </w:r>
+      <w:r>
+        <w:rPr>
+          <w:rFonts w:ascii="Microsoft JhengHei" w:hAnsi="Microsoft JhengHei" w:eastAsia="Microsoft JhengHei"/>
+          <w:b/>
+          <w:sz w:val="21"/>
+        </w:rPr>
+        <w:t>17:30 - 19:00</w:t>
+      </w:r>
+      <w:r>
+        <w:rPr>
+          <w:rFonts w:ascii="Microsoft JhengHei" w:hAnsi="Microsoft JhengHei" w:eastAsia="Microsoft JhengHei"/>
+          <w:sz w:val="21"/>
+        </w:rPr>
+        <w:t xml:space="preserve"> 自由時間（伴手禮補逛、共和廣場、街頭咖啡）</w:t>
       </w:r>
     </w:p>
     <w:p>
@@ -3731,7 +3776,37 @@
           <w:rFonts w:ascii="Microsoft JhengHei" w:hAnsi="Microsoft JhengHei" w:eastAsia="Microsoft JhengHei"/>
           <w:sz w:val="21"/>
         </w:rPr>
-        <w:t>• 💡 名字來自中世紀的「襪子工匠」，現在是品牌店和冰淇淋店林立的逛街主動線，走著走著一抬頭就會撞見百花大教堂穹頂</w:t>
+        <w:t xml:space="preserve">• </w:t>
+      </w:r>
+      <w:r>
+        <w:rPr>
+          <w:rFonts w:ascii="Microsoft JhengHei" w:hAnsi="Microsoft JhengHei" w:eastAsia="Microsoft JhengHei"/>
+          <w:b/>
+          <w:sz w:val="21"/>
+        </w:rPr>
+        <w:t>19:00</w:t>
+      </w:r>
+      <w:r>
+        <w:rPr>
+          <w:rFonts w:ascii="Microsoft JhengHei" w:hAnsi="Microsoft JhengHei" w:eastAsia="Microsoft JhengHei"/>
+          <w:sz w:val="21"/>
+        </w:rPr>
+        <w:t xml:space="preserve"> 🍽 晚餐：</w:t>
+      </w:r>
+      <w:r>
+        <w:rPr>
+          <w:rFonts w:ascii="Microsoft JhengHei" w:hAnsi="Microsoft JhengHei" w:eastAsia="Microsoft JhengHei"/>
+          <w:b/>
+          <w:sz w:val="21"/>
+        </w:rPr>
+        <w:t>Trattoria 4 Leoni（首推）</w:t>
+      </w:r>
+      <w:r>
+        <w:rPr>
+          <w:rFonts w:ascii="Microsoft JhengHei" w:hAnsi="Microsoft JhengHei" w:eastAsia="Microsoft JhengHei"/>
+          <w:sz w:val="21"/>
+        </w:rPr>
+        <w:t xml:space="preserve"> — Via dei Vellutini, 1r, Piazza della Passera（南岸 Oltrarno）</w:t>
       </w:r>
     </w:p>
     <w:p>
@@ -3743,22 +3818,7 @@
           <w:rFonts w:ascii="Microsoft JhengHei" w:hAnsi="Microsoft JhengHei" w:eastAsia="Microsoft JhengHei"/>
           <w:sz w:val="21"/>
         </w:rPr>
-        <w:t xml:space="preserve">• </w:t>
-      </w:r>
-      <w:r>
-        <w:rPr>
-          <w:rFonts w:ascii="Microsoft JhengHei" w:hAnsi="Microsoft JhengHei" w:eastAsia="Microsoft JhengHei"/>
-          <w:b/>
-          <w:sz w:val="21"/>
-        </w:rPr>
-        <w:t>19:00</w:t>
-      </w:r>
-      <w:r>
-        <w:rPr>
-          <w:rFonts w:ascii="Microsoft JhengHei" w:hAnsi="Microsoft JhengHei" w:eastAsia="Microsoft JhengHei"/>
-          <w:sz w:val="21"/>
-        </w:rPr>
-        <w:t xml:space="preserve"> 🍽 晚餐：南岸或舊橋附近（待挑：須 20:00 前能吃完）</w:t>
+        <w:t>• Gambero Rosso「Trattorie d'Italia」歷史榜單、創於 1550 年；招牌梨子起司包餡麵食、佛羅倫斯牛排</w:t>
       </w:r>
     </w:p>
     <w:p>
@@ -3770,22 +3830,7 @@
           <w:rFonts w:ascii="Microsoft JhengHei" w:hAnsi="Microsoft JhengHei" w:eastAsia="Microsoft JhengHei"/>
           <w:sz w:val="21"/>
         </w:rPr>
-        <w:t xml:space="preserve">• </w:t>
-      </w:r>
-      <w:r>
-        <w:rPr>
-          <w:rFonts w:ascii="Microsoft JhengHei" w:hAnsi="Microsoft JhengHei" w:eastAsia="Microsoft JhengHei"/>
-          <w:b/>
-          <w:sz w:val="21"/>
-        </w:rPr>
-        <w:t>20:00</w:t>
-      </w:r>
-      <w:r>
-        <w:rPr>
-          <w:rFonts w:ascii="Microsoft JhengHei" w:hAnsi="Microsoft JhengHei" w:eastAsia="Microsoft JhengHei"/>
-          <w:sz w:val="21"/>
-        </w:rPr>
-        <w:t xml:space="preserve"> 🚕 計程車上山前往 Piazzale Michelangelo（€15-18，車程約 12 分鐘）</w:t>
+        <w:t>• 12:00-23:00 連續營業（南岸唯一可 19:00 入座；其他多 19:30 才開）</w:t>
       </w:r>
     </w:p>
     <w:p>
@@ -3797,36 +3842,7 @@
           <w:rFonts w:ascii="Microsoft JhengHei" w:hAnsi="Microsoft JhengHei" w:eastAsia="Microsoft JhengHei"/>
           <w:sz w:val="21"/>
         </w:rPr>
-        <w:t xml:space="preserve">• </w:t>
-      </w:r>
-      <w:r>
-        <w:rPr>
-          <w:rFonts w:ascii="Microsoft JhengHei" w:hAnsi="Microsoft JhengHei" w:eastAsia="Microsoft JhengHei"/>
-          <w:b/>
-          <w:sz w:val="21"/>
-        </w:rPr>
-        <w:t>20:15 - 20:55</w:t>
-      </w:r>
-      <w:r>
-        <w:rPr>
-          <w:rFonts w:ascii="Microsoft JhengHei" w:hAnsi="Microsoft JhengHei" w:eastAsia="Microsoft JhengHei"/>
-          <w:sz w:val="21"/>
-        </w:rPr>
-        <w:t xml:space="preserve"> 🌄 </w:t>
-      </w:r>
-      <w:r>
-        <w:rPr>
-          <w:rFonts w:ascii="Microsoft JhengHei" w:hAnsi="Microsoft JhengHei" w:eastAsia="Microsoft JhengHei"/>
-          <w:b/>
-          <w:sz w:val="21"/>
-        </w:rPr>
-        <w:t>Piazzale Michelangelo（米開朗基羅廣場）+ San Miniato al Monte 外部平台</w:t>
-      </w:r>
-      <w:r>
-        <w:rPr>
-          <w:rFonts w:ascii="Microsoft JhengHei" w:hAnsi="Microsoft JhengHei" w:eastAsia="Microsoft JhengHei"/>
-          <w:sz w:val="21"/>
-        </w:rPr>
+        <w:t>• 訂位 +39 055 218562，至少 2 週前；註明 5 人、19:00、20:30 前離席</w:t>
       </w:r>
     </w:p>
     <w:p>
@@ -3838,7 +3854,7 @@
           <w:rFonts w:ascii="Microsoft JhengHei" w:hAnsi="Microsoft JhengHei" w:eastAsia="Microsoft JhengHei"/>
           <w:sz w:val="21"/>
         </w:rPr>
-        <w:t>• 廣場大衛像複製品右後方拍 Duomo + Ponte Vecchio + 阿諾河</w:t>
+        <w:t>• 備案：Il Santo Bevitore（米其林 2026 推薦，19:30 開）、Osteria Tripperia Il Magazzino（19:30 開）</w:t>
       </w:r>
     </w:p>
     <w:p>
@@ -3850,7 +3866,7 @@
           <w:rFonts w:ascii="Microsoft JhengHei" w:hAnsi="Microsoft JhengHei" w:eastAsia="Microsoft JhengHei"/>
           <w:sz w:val="21"/>
         </w:rPr>
-        <w:t>• 步行 5 分鐘上 San Miniato al Monte 教堂前平台（外部平台視野更高、人少）</w:t>
+        <w:t>• 預算：每人 €35-45</w:t>
       </w:r>
     </w:p>
     <w:p>
@@ -3870,29 +3886,14 @@
           <w:b/>
           <w:sz w:val="21"/>
         </w:rPr>
-        <w:t>20:59</w:t>
-      </w:r>
-      <w:r>
-        <w:rPr>
-          <w:rFonts w:ascii="Microsoft JhengHei" w:hAnsi="Microsoft JhengHei" w:eastAsia="Microsoft JhengHei"/>
-          <w:sz w:val="21"/>
-        </w:rPr>
-        <w:t xml:space="preserve"> ✨ </w:t>
-      </w:r>
-      <w:r>
-        <w:rPr>
-          <w:rFonts w:ascii="Microsoft JhengHei" w:hAnsi="Microsoft JhengHei" w:eastAsia="Microsoft JhengHei"/>
-          <w:b/>
-          <w:sz w:val="21"/>
-        </w:rPr>
-        <w:t>日落</w:t>
-      </w:r>
-      <w:r>
-        <w:rPr>
-          <w:rFonts w:ascii="Microsoft JhengHei" w:hAnsi="Microsoft JhengHei" w:eastAsia="Microsoft JhengHei"/>
-          <w:sz w:val="21"/>
-        </w:rPr>
-        <w:t>（2026/6/18 佛羅倫斯確切日落）</w:t>
+        <w:t>20:00</w:t>
+      </w:r>
+      <w:r>
+        <w:rPr>
+          <w:rFonts w:ascii="Microsoft JhengHei" w:hAnsi="Microsoft JhengHei" w:eastAsia="Microsoft JhengHei"/>
+          <w:sz w:val="21"/>
+        </w:rPr>
+        <w:t xml:space="preserve"> 🚕 計程車上山前往 Piazzale Michelangelo（€15-18，車程約 12 分鐘）</w:t>
       </w:r>
     </w:p>
     <w:p>
@@ -3904,7 +3905,7 @@
           <w:rFonts w:ascii="Microsoft JhengHei" w:hAnsi="Microsoft JhengHei" w:eastAsia="Microsoft JhengHei"/>
           <w:sz w:val="21"/>
         </w:rPr>
-        <w:t xml:space="preserve">• </w:t>
+        <w:t xml:space="preserve">• ⚠ </w:t>
       </w:r>
       <w:r>
         <w:rPr>
@@ -3912,14 +3913,14 @@
           <w:b/>
           <w:sz w:val="21"/>
         </w:rPr>
-        <w:t>21:00 - 21:35</w:t>
-      </w:r>
-      <w:r>
-        <w:rPr>
-          <w:rFonts w:ascii="Microsoft JhengHei" w:hAnsi="Microsoft JhengHei" w:eastAsia="Microsoft JhengHei"/>
-          <w:sz w:val="21"/>
-        </w:rPr>
-        <w:t xml:space="preserve"> 📷 藍調夜景時段（最美時段）</w:t>
+        <w:t>5 人需叫 Large Taxi / Van</w:t>
+      </w:r>
+      <w:r>
+        <w:rPr>
+          <w:rFonts w:ascii="Microsoft JhengHei" w:hAnsi="Microsoft JhengHei" w:eastAsia="Microsoft JhengHei"/>
+          <w:sz w:val="21"/>
+        </w:rPr>
+        <w:t>（一般義大利計程車僅 4 人座）</w:t>
       </w:r>
     </w:p>
     <w:p>
@@ -3931,6 +3932,18 @@
           <w:rFonts w:ascii="Microsoft JhengHei" w:hAnsi="Microsoft JhengHei" w:eastAsia="Microsoft JhengHei"/>
           <w:sz w:val="21"/>
         </w:rPr>
+        <w:t>• 佛羅倫斯計程車夜間費率 22:00-06:00（夜間起跳 €7.70、最低 €9.70）；21:45 回程仍屬日間</w:t>
+      </w:r>
+    </w:p>
+    <w:p>
+      <w:pPr>
+        <w:ind w:left="454" w:hanging="227"/>
+      </w:pPr>
+      <w:r>
+        <w:rPr>
+          <w:rFonts w:ascii="Microsoft JhengHei" w:hAnsi="Microsoft JhengHei" w:eastAsia="Microsoft JhengHei"/>
+          <w:sz w:val="21"/>
+        </w:rPr>
         <w:t xml:space="preserve">• </w:t>
       </w:r>
       <w:r>
@@ -3939,14 +3952,14 @@
           <w:b/>
           <w:sz w:val="21"/>
         </w:rPr>
-        <w:t>21:40</w:t>
-      </w:r>
-      <w:r>
-        <w:rPr>
-          <w:rFonts w:ascii="Microsoft JhengHei" w:hAnsi="Microsoft JhengHei" w:eastAsia="Microsoft JhengHei"/>
-          <w:sz w:val="21"/>
-        </w:rPr>
-        <w:t xml:space="preserve"> 🚌 回程：itTaxi App 叫車 或 </w:t>
+        <w:t>20:10 - 20:45</w:t>
+      </w:r>
+      <w:r>
+        <w:rPr>
+          <w:rFonts w:ascii="Microsoft JhengHei" w:hAnsi="Microsoft JhengHei" w:eastAsia="Microsoft JhengHei"/>
+          <w:sz w:val="21"/>
+        </w:rPr>
+        <w:t xml:space="preserve"> 🌄 </w:t>
       </w:r>
       <w:r>
         <w:rPr>
@@ -3954,14 +3967,235 @@
           <w:b/>
           <w:sz w:val="21"/>
         </w:rPr>
-        <w:t>13 路公車</w:t>
-      </w:r>
-      <w:r>
-        <w:rPr>
-          <w:rFonts w:ascii="Microsoft JhengHei" w:hAnsi="Microsoft JhengHei" w:eastAsia="Microsoft JhengHei"/>
-          <w:sz w:val="21"/>
-        </w:rPr>
-        <w:t>回 SMN 火車站（€1.70/人，營運至 23:30）</w:t>
+        <w:t>Piazzale Michelangelo + San Miniato al Monte 外部平台</w:t>
+      </w:r>
+      <w:r>
+        <w:rPr>
+          <w:rFonts w:ascii="Microsoft JhengHei" w:hAnsi="Microsoft JhengHei" w:eastAsia="Microsoft JhengHei"/>
+          <w:sz w:val="21"/>
+        </w:rPr>
+      </w:r>
+    </w:p>
+    <w:p>
+      <w:pPr>
+        <w:ind w:left="454" w:hanging="227"/>
+      </w:pPr>
+      <w:r>
+        <w:rPr>
+          <w:rFonts w:ascii="Microsoft JhengHei" w:hAnsi="Microsoft JhengHei" w:eastAsia="Microsoft JhengHei"/>
+          <w:sz w:val="21"/>
+        </w:rPr>
+        <w:t>• 20:10 抵達廣場（先卡日落位置）</w:t>
+      </w:r>
+    </w:p>
+    <w:p>
+      <w:pPr>
+        <w:ind w:left="454" w:hanging="227"/>
+      </w:pPr>
+      <w:r>
+        <w:rPr>
+          <w:rFonts w:ascii="Microsoft JhengHei" w:hAnsi="Microsoft JhengHei" w:eastAsia="Microsoft JhengHei"/>
+          <w:sz w:val="21"/>
+        </w:rPr>
+        <w:t>• 20:15-20:40 步行 5 分鐘上 San Miniato al Monte 教堂前平台（19:00 後內部已關；若鐵門關閉則在米開朗基羅廣場大階梯觀賞）</w:t>
+      </w:r>
+    </w:p>
+    <w:p>
+      <w:pPr>
+        <w:ind w:left="454" w:hanging="227"/>
+      </w:pPr>
+      <w:r>
+        <w:rPr>
+          <w:rFonts w:ascii="Microsoft JhengHei" w:hAnsi="Microsoft JhengHei" w:eastAsia="Microsoft JhengHei"/>
+          <w:sz w:val="21"/>
+        </w:rPr>
+        <w:t>• 拍 Duomo + Ponte Vecchio + 阿諾河（廣場大衛像複製品右後方為經典壓縮構圖）</w:t>
+      </w:r>
+    </w:p>
+    <w:p>
+      <w:pPr>
+        <w:ind w:left="454" w:hanging="227"/>
+      </w:pPr>
+      <w:r>
+        <w:rPr>
+          <w:rFonts w:ascii="Microsoft JhengHei" w:hAnsi="Microsoft JhengHei" w:eastAsia="Microsoft JhengHei"/>
+          <w:sz w:val="21"/>
+        </w:rPr>
+        <w:t>• ⚠ 玫瑰花園 5-9 月開放至 20:00，日落時已關，不用繞</w:t>
+      </w:r>
+    </w:p>
+    <w:p>
+      <w:pPr>
+        <w:ind w:left="454" w:hanging="227"/>
+      </w:pPr>
+      <w:r>
+        <w:rPr>
+          <w:rFonts w:ascii="Microsoft JhengHei" w:hAnsi="Microsoft JhengHei" w:eastAsia="Microsoft JhengHei"/>
+          <w:sz w:val="21"/>
+        </w:rPr>
+        <w:t xml:space="preserve">• </w:t>
+      </w:r>
+      <w:r>
+        <w:rPr>
+          <w:rFonts w:ascii="Microsoft JhengHei" w:hAnsi="Microsoft JhengHei" w:eastAsia="Microsoft JhengHei"/>
+          <w:b/>
+          <w:sz w:val="21"/>
+        </w:rPr>
+        <w:t>20:59</w:t>
+      </w:r>
+      <w:r>
+        <w:rPr>
+          <w:rFonts w:ascii="Microsoft JhengHei" w:hAnsi="Microsoft JhengHei" w:eastAsia="Microsoft JhengHei"/>
+          <w:sz w:val="21"/>
+        </w:rPr>
+        <w:t xml:space="preserve"> ✨ </w:t>
+      </w:r>
+      <w:r>
+        <w:rPr>
+          <w:rFonts w:ascii="Microsoft JhengHei" w:hAnsi="Microsoft JhengHei" w:eastAsia="Microsoft JhengHei"/>
+          <w:b/>
+          <w:sz w:val="21"/>
+        </w:rPr>
+        <w:t>日落</w:t>
+      </w:r>
+      <w:r>
+        <w:rPr>
+          <w:rFonts w:ascii="Microsoft JhengHei" w:hAnsi="Microsoft JhengHei" w:eastAsia="Microsoft JhengHei"/>
+          <w:sz w:val="21"/>
+        </w:rPr>
+        <w:t>（2026/6/18 佛羅倫斯確切日落）</w:t>
+      </w:r>
+    </w:p>
+    <w:p>
+      <w:pPr>
+        <w:ind w:left="454" w:hanging="227"/>
+      </w:pPr>
+      <w:r>
+        <w:rPr>
+          <w:rFonts w:ascii="Microsoft JhengHei" w:hAnsi="Microsoft JhengHei" w:eastAsia="Microsoft JhengHei"/>
+          <w:sz w:val="21"/>
+        </w:rPr>
+        <w:t xml:space="preserve">• </w:t>
+      </w:r>
+      <w:r>
+        <w:rPr>
+          <w:rFonts w:ascii="Microsoft JhengHei" w:hAnsi="Microsoft JhengHei" w:eastAsia="Microsoft JhengHei"/>
+          <w:b/>
+          <w:sz w:val="21"/>
+        </w:rPr>
+        <w:t>21:00 - 21:30</w:t>
+      </w:r>
+      <w:r>
+        <w:rPr>
+          <w:rFonts w:ascii="Microsoft JhengHei" w:hAnsi="Microsoft JhengHei" w:eastAsia="Microsoft JhengHei"/>
+          <w:sz w:val="21"/>
+        </w:rPr>
+        <w:t xml:space="preserve"> 📷 藍調夜景時段</w:t>
+      </w:r>
+    </w:p>
+    <w:p>
+      <w:pPr>
+        <w:ind w:left="454" w:hanging="227"/>
+      </w:pPr>
+      <w:r>
+        <w:rPr>
+          <w:rFonts w:ascii="Microsoft JhengHei" w:hAnsi="Microsoft JhengHei" w:eastAsia="Microsoft JhengHei"/>
+          <w:sz w:val="21"/>
+        </w:rPr>
+        <w:t xml:space="preserve">• </w:t>
+      </w:r>
+      <w:r>
+        <w:rPr>
+          <w:rFonts w:ascii="Microsoft JhengHei" w:hAnsi="Microsoft JhengHei" w:eastAsia="Microsoft JhengHei"/>
+          <w:b/>
+          <w:sz w:val="21"/>
+        </w:rPr>
+        <w:t>21:35</w:t>
+      </w:r>
+      <w:r>
+        <w:rPr>
+          <w:rFonts w:ascii="Microsoft JhengHei" w:hAnsi="Microsoft JhengHei" w:eastAsia="Microsoft JhengHei"/>
+          <w:sz w:val="21"/>
+        </w:rPr>
+        <w:t xml:space="preserve"> 🚌 開始撤退（22:15 前回住宿，確保隔天 Day 6 圓頂 463 階體力）</w:t>
+      </w:r>
+    </w:p>
+    <w:p>
+      <w:pPr>
+        <w:ind w:left="454" w:hanging="227"/>
+      </w:pPr>
+      <w:r>
+        <w:rPr>
+          <w:rFonts w:ascii="Microsoft JhengHei" w:hAnsi="Microsoft JhengHei" w:eastAsia="Microsoft JhengHei"/>
+          <w:sz w:val="21"/>
+        </w:rPr>
+        <w:t>• 首選：itTaxi App 預先叫車（5 人指定 Van）</w:t>
+      </w:r>
+    </w:p>
+    <w:p>
+      <w:pPr>
+        <w:ind w:left="454" w:hanging="227"/>
+      </w:pPr>
+      <w:r>
+        <w:rPr>
+          <w:rFonts w:ascii="Microsoft JhengHei" w:hAnsi="Microsoft JhengHei" w:eastAsia="Microsoft JhengHei"/>
+          <w:sz w:val="21"/>
+        </w:rPr>
+        <w:t>• 備案：</w:t>
+      </w:r>
+      <w:r>
+        <w:rPr>
+          <w:rFonts w:ascii="Microsoft JhengHei" w:hAnsi="Microsoft JhengHei" w:eastAsia="Microsoft JhengHei"/>
+          <w:b/>
+          <w:sz w:val="21"/>
+        </w:rPr>
+        <w:t>12 路公車</w:t>
+      </w:r>
+      <w:r>
+        <w:rPr>
+          <w:rFonts w:ascii="Microsoft JhengHei" w:hAnsi="Microsoft JhengHei" w:eastAsia="Microsoft JhengHei"/>
+          <w:sz w:val="21"/>
+        </w:rPr>
+        <w:t>回 Stazione FS SMN（€1.70/人，末班約 23:30）</w:t>
+      </w:r>
+    </w:p>
+    <w:p>
+      <w:pPr>
+        <w:ind w:left="454" w:hanging="227"/>
+      </w:pPr>
+      <w:r>
+        <w:rPr>
+          <w:rFonts w:ascii="Microsoft JhengHei" w:hAnsi="Microsoft JhengHei" w:eastAsia="Microsoft JhengHei"/>
+          <w:sz w:val="21"/>
+        </w:rPr>
+        <w:t>• 注意：13 路為「Piazzale Michelangiolo - Rotonda Barbetti」，非首選回程</w:t>
+      </w:r>
+    </w:p>
+    <w:p>
+      <w:pPr>
+        <w:ind w:left="454" w:hanging="227"/>
+      </w:pPr>
+      <w:r>
+        <w:rPr>
+          <w:rFonts w:ascii="Microsoft JhengHei" w:hAnsi="Microsoft JhengHei" w:eastAsia="Microsoft JhengHei"/>
+          <w:sz w:val="21"/>
+        </w:rPr>
+        <w:t xml:space="preserve">• </w:t>
+      </w:r>
+      <w:r>
+        <w:rPr>
+          <w:rFonts w:ascii="Microsoft JhengHei" w:hAnsi="Microsoft JhengHei" w:eastAsia="Microsoft JhengHei"/>
+          <w:b/>
+          <w:sz w:val="21"/>
+        </w:rPr>
+        <w:t>防扒</w:t>
+      </w:r>
+      <w:r>
+        <w:rPr>
+          <w:rFonts w:ascii="Microsoft JhengHei" w:hAnsi="Microsoft JhengHei" w:eastAsia="Microsoft JhengHei"/>
+          <w:sz w:val="21"/>
+        </w:rPr>
+        <w:t>：廣場日落時人潮極多、扒手熱點，包包前背、手機別放後口袋</w:t>
       </w:r>
     </w:p>
     <w:p>
@@ -4424,14 +4658,14 @@
           <w:b/>
           <w:sz w:val="21"/>
         </w:rPr>
-        <w:t>Osteria del Cinghiale Bianco</w:t>
-      </w:r>
-      <w:r>
-        <w:rPr>
-          <w:rFonts w:ascii="Microsoft JhengHei" w:hAnsi="Microsoft JhengHei" w:eastAsia="Microsoft JhengHei"/>
-          <w:sz w:val="21"/>
-        </w:rPr>
-        <w:t>（白野豬）：南岸知名老店，野豬肉醬寬扁麵 + 佛羅倫斯丁骨牛排</w:t>
+        <w:t>彈性 walk-in（隨遇而安）</w:t>
+      </w:r>
+      <w:r>
+        <w:rPr>
+          <w:rFonts w:ascii="Microsoft JhengHei" w:hAnsi="Microsoft JhengHei" w:eastAsia="Microsoft JhengHei"/>
+          <w:sz w:val="21"/>
+        </w:rPr>
+        <w:t xml:space="preserve"> — 南岸 Oltrarno 區任選</w:t>
       </w:r>
     </w:p>
     <w:p>
@@ -4443,7 +4677,7 @@
           <w:rFonts w:ascii="Microsoft JhengHei" w:hAnsi="Microsoft JhengHei" w:eastAsia="Microsoft JhengHei"/>
           <w:sz w:val="21"/>
         </w:rPr>
-        <w:t>• 💡 原訂 6/18 中午但</w:t>
+        <w:t>• 🥇 首選：</w:t>
       </w:r>
       <w:r>
         <w:rPr>
@@ -4451,14 +4685,14 @@
           <w:b/>
           <w:sz w:val="21"/>
         </w:rPr>
-        <w:t>週四中午不營業（官方確認）</w:t>
-      </w:r>
-      <w:r>
-        <w:rPr>
-          <w:rFonts w:ascii="Microsoft JhengHei" w:hAnsi="Microsoft JhengHei" w:eastAsia="Microsoft JhengHei"/>
-          <w:sz w:val="21"/>
-        </w:rPr>
-        <w:t>，挪到 6/19 晚餐 — 週五晚正常營業</w:t>
+        <w:t>Osteria del Cinghiale Bianco</w:t>
+      </w:r>
+      <w:r>
+        <w:rPr>
+          <w:rFonts w:ascii="Microsoft JhengHei" w:hAnsi="Microsoft JhengHei" w:eastAsia="Microsoft JhengHei"/>
+          <w:sz w:val="21"/>
+        </w:rPr>
+        <w:t>（白野豬）— 野豬肉醬寬扁麵 + 丁骨牛排</w:t>
       </w:r>
     </w:p>
     <w:p>
@@ -4470,7 +4704,7 @@
           <w:rFonts w:ascii="Microsoft JhengHei" w:hAnsi="Microsoft JhengHei" w:eastAsia="Microsoft JhengHei"/>
           <w:sz w:val="21"/>
         </w:rPr>
-        <w:t xml:space="preserve">• ⚠ 建議 </w:t>
+        <w:t xml:space="preserve">• 🥈 替代鏈：白野豬滿位 → </w:t>
       </w:r>
       <w:r>
         <w:rPr>
@@ -4478,14 +4712,41 @@
           <w:b/>
           <w:sz w:val="21"/>
         </w:rPr>
-        <w:t>5/30 前</w:t>
-      </w:r>
-      <w:r>
-        <w:rPr>
-          <w:rFonts w:ascii="Microsoft JhengHei" w:hAnsi="Microsoft JhengHei" w:eastAsia="Microsoft JhengHei"/>
-          <w:sz w:val="21"/>
-        </w:rPr>
-        <w:t>訂位（5 人桌，旺季熱門）</w:t>
+        <w:t>Trattoria Cammillo</w:t>
+      </w:r>
+      <w:r>
+        <w:rPr>
+          <w:rFonts w:ascii="Microsoft JhengHei" w:hAnsi="Microsoft JhengHei" w:eastAsia="Microsoft JhengHei"/>
+          <w:sz w:val="21"/>
+        </w:rPr>
+        <w:t xml:space="preserve">（同條街 100m，米其林指南收錄）→ </w:t>
+      </w:r>
+      <w:r>
+        <w:rPr>
+          <w:rFonts w:ascii="Microsoft JhengHei" w:hAnsi="Microsoft JhengHei" w:eastAsia="Microsoft JhengHei"/>
+          <w:b/>
+          <w:sz w:val="21"/>
+        </w:rPr>
+        <w:t>Mercato Centrale 二樓</w:t>
+      </w:r>
+      <w:r>
+        <w:rPr>
+          <w:rFonts w:ascii="Microsoft JhengHei" w:hAnsi="Microsoft JhengHei" w:eastAsia="Microsoft JhengHei"/>
+          <w:sz w:val="21"/>
+        </w:rPr>
+        <w:t>（北岸 backup）</w:t>
+      </w:r>
+    </w:p>
+    <w:p>
+      <w:pPr>
+        <w:ind w:left="454" w:hanging="227"/>
+      </w:pPr>
+      <w:r>
+        <w:rPr>
+          <w:rFonts w:ascii="Microsoft JhengHei" w:hAnsi="Microsoft JhengHei" w:eastAsia="Microsoft JhengHei"/>
+          <w:sz w:val="21"/>
+        </w:rPr>
+        <w:t>• 💡 19:30 前到通常有位（旺季 20:00 後地獄時段）</w:t>
       </w:r>
     </w:p>
     <w:p>
@@ -8836,7 +9097,22 @@
           <w:rFonts w:ascii="Microsoft JhengHei" w:hAnsi="Microsoft JhengHei" w:eastAsia="Microsoft JhengHei"/>
           <w:sz w:val="21"/>
         </w:rPr>
-        <w:t>☐ 訂 6/19 晚餐 Osteria del Cinghiale Bianco（5 人桌，5/30 前訂位）</w:t>
+        <w:t xml:space="preserve">☑ ~~訂 6/19 晚餐 Osteria del Cinghiale Bianco~~ → </w:t>
+      </w:r>
+      <w:r>
+        <w:rPr>
+          <w:rFonts w:ascii="Microsoft JhengHei" w:hAnsi="Microsoft JhengHei" w:eastAsia="Microsoft JhengHei"/>
+          <w:b/>
+          <w:sz w:val="21"/>
+        </w:rPr>
+        <w:t>改走彈性 walk-in 風格</w:t>
+      </w:r>
+      <w:r>
+        <w:rPr>
+          <w:rFonts w:ascii="Microsoft JhengHei" w:hAnsi="Microsoft JhengHei" w:eastAsia="Microsoft JhengHei"/>
+          <w:sz w:val="21"/>
+        </w:rPr>
+        <w:t>（不訂位，當天走南岸：白野豬→Cammillo→Mercato Centrale 二樓）</w:t>
       </w:r>
     </w:p>
     <w:p>

</xml_diff>